<commit_message>
Centra el experimento del informe en el problema de negocio y corrige la sección 3.5
</commit_message>
<xml_diff>
--- a/docs/Informe_Proyecto_Final_Grupo04.docx
+++ b/docs/Informe_Proyecto_Final_Grupo04.docx
@@ -1658,7 +1658,7 @@
           <w:sz w:val="19"/>
           <w:lang w:val="es-PE"/>
         </w:rPr>
-        <w:t xml:space="preserve">Las reservas en Tunki Lodge vienen cayendo y el sistema Estadía no ofrece ninguna forma de explicar por qué. Entre enero y octubre de 2026 se registraron 2 179 reservas frente a 2 909 en el mismo periodo de 2025 (−25.1 %), el ingreso cobrado bajó 30.2 % y la tasa de cancelación pasó de 5.1 % en enero a 19.2 % en septiembre, cuando en 2024 y 2025 se mantuvo estable en 5 %. El objetivo del proyecto fue diseñar e implementar una solución de Inteligencia de Negocios que explique esa caída e identifique en qué segmentos se concentra la no-llegada de huéspedes (cancelaciones y no-show). La solución integra la base operativa alquiler (SQL Server) y tres archivos planos en un datamart en esquema estrella (hotel_dw) con cinco dimensiones y cuatro medidas, mediante un proceso ETL en T-SQL de ocho pasos que aplica once reglas de calidad de datos, controla errores con TRY/CATCH, registra su consumo de tiempo, CPU y lecturas en una bitácora y se ejecuta de forma automática con el Programador de tareas de Windows. Los indicadores se presentan en un dashboard de Power BI con medidas DAX. El diseño experimental midió el costo del ETL con lotes de 500 a 15 000 estadías, la eficacia de las reglas de calidad con datos defectuosos y la coincidencia de los indicadores entre SQL y Power BI. El ETL carga 15 000 estadías en 3.5 s con un crecimiento casi lineal, detectó el 100 % de los 14 registros defectuosos inyectados y los indicadores coinciden en ambas herramientas. La no-llegada es tres veces mayor en clientes de ciudades lejanas (15.2 %) que en los de ciudades cercanas a Oxapampa (4.5 %) y dos veces mayor con pago en efectivo (13.5 %) que con transferencia (6.8 %). Se concluye que la caída se explica por el crecimiento de los segmentos de mayor riesgo, lo que permite orientar ofertas dirigidas en lugar de descuentos generales.</w:t>
+        <w:t xml:space="preserve">Las reservas en Tunki Lodge vienen cayendo y el sistema Estadía no ofrece ninguna forma de explicar por qué. Entre enero y octubre de 2026 se registraron 2 179 reservas frente a 2 909 en el mismo periodo de 2025 (−25.1 %), el ingreso cobrado bajó 30.2 % y la tasa de cancelación pasó de 5.1 % en enero a 19.2 % en septiembre, cuando en 2024 y 2025 se mantuvo estable en 5 %. El objetivo del proyecto fue diseñar e implementar una solución de Inteligencia de Negocios que explique esa caída e identifique en qué segmentos se concentra la no-llegada de huéspedes (cancelaciones y no-show). La solución integra la base operativa alquiler (SQL Server) y tres archivos planos en un datamart en esquema estrella (hotel_dw) con cinco dimensiones y cuatro medidas, mediante un proceso ETL en T-SQL de ocho pasos que aplica once reglas de calidad de datos, controla errores con TRY/CATCH, registra su consumo de tiempo, CPU y lecturas en una bitácora y se ejecuta de forma automática con el Programador de tareas de Windows. Los indicadores se presentan en un dashboard de Power BI con medidas DAX. El diseño experimental comparó la tasa de no-llegada por segmento entre 2024–2025 y 2026, y validó la solución midiendo el costo del ETL con lotes de 500 a 15 000 estadías, la eficacia de las reglas de calidad con datos defectuosos y la coincidencia de los indicadores entre SQL y Power BI. El ETL carga 15 000 estadías en 3.5 s con un crecimiento casi lineal, detectó el 100 % de los 14 registros defectuosos inyectados y los indicadores coinciden en ambas herramientas. La no-llegada es tres veces mayor en clientes de ciudades lejanas (15.2 %) que en los de ciudades cercanas a Oxapampa (4.5 %) y dos veces mayor con pago en efectivo (13.5 %) que con transferencia (6.8 %). Se concluye que la caída se explica por el crecimiento de los segmentos de mayor riesgo, lo que permite orientar ofertas dirigidas en lugar de descuentos generales.</w:t>
       </w:r>
     </w:p>
     <w:p>
@@ -1698,7 +1698,7 @@
           <w:sz w:val="19"/>
           <w:lang w:val="es-PE"/>
         </w:rPr>
-        <w:t xml:space="preserve">Bookings at Tunki Lodge have been falling, and the Estadía system offers no way to explain why. Between January and October 2026, 2,179 bookings were recorded versus 2,909 in the same period of 2025 (−25.1%), collected revenue dropped 30.2%, and the cancellation rate rose from 5.1% in January to 19.2% in September, whereas it remained stable at 5% in 2024 and 2025. The goal of the project was to design and implement a Business Intelligence solution that explains this decline and identifies the segments where guest no-arrivals (cancellations and no-shows) concentrate. The solution integrates the operational database (alquiler, SQL Server) and three flat files into a star-schema data mart (hotel_dw) with five dimensions and four measures, through an eight-step T-SQL ETL process that applies eleven data-quality rules, handles errors with TRY/CATCH, logs its time, CPU and reads, and runs automatically through Windows Task Scheduler. Indicators are presented in a Power BI dashboard with DAX measures. The experimental design measured the ETL cost with batches of 500 to 15,000 stays, the effectiveness of the quality rules with defective data, and the agreement of indicators between SQL and Power BI. The ETL loads 15,000 stays in 3.5 s with almost linear growth, detected 100% of the 14 injected defective records, and indicators match in both tools. No-arrivals are three times higher for guests from distant cities (15.2%) than for those from cities near Oxapampa (4.5%), and twice as high with cash payment (13.5%) as with bank transfer (6.8%). We conclude that the decline is explained by the growth of the highest-risk segments, which supports targeted offers instead of general discounts.</w:t>
+        <w:t xml:space="preserve">Bookings at Tunki Lodge have been falling, and the Estadía system offers no way to explain why. Between January and October 2026, 2,179 bookings were recorded versus 2,909 in the same period of 2025 (−25.1%), collected revenue dropped 30.2%, and the cancellation rate rose from 5.1% in January to 19.2% in September, whereas it remained stable at 5% in 2024 and 2025. The goal of the project was to design and implement a Business Intelligence solution that explains this decline and identifies the segments where guest no-arrivals (cancellations and no-shows) concentrate. The solution integrates the operational database (alquiler, SQL Server) and three flat files into a star-schema data mart (hotel_dw) with five dimensions and four measures, through an eight-step T-SQL ETL process that applies eleven data-quality rules, handles errors with TRY/CATCH, logs its time, CPU and reads, and runs automatically through Windows Task Scheduler. Indicators are presented in a Power BI dashboard with DAX measures. The experimental design compared the no-arrival rate by segment between 2024–2025 and 2026, and validated the solution by measuring the ETL cost with batches of 500 to 15,000 stays, the effectiveness of the quality rules with defective data, and the agreement of indicators between SQL and Power BI. The ETL loads 15,000 stays in 3.5 s with almost linear growth, detected 100% of the 14 injected defective records, and indicators match in both tools. No-arrivals are three times higher for guests from distant cities (15.2%) than for those from cities near Oxapampa (4.5%), and twice as high with cash payment (13.5%) as with bank transfer (6.8%). We conclude that the decline is explained by the growth of the highest-risk segments, which supports targeted offers instead of general discounts.</w:t>
       </w:r>
     </w:p>
     <w:p>
@@ -1985,7 +1985,7 @@
           <w:sz w:val="19"/>
           <w:lang w:val="es-PE"/>
         </w:rPr>
-        <w:t xml:space="preserve">Diseñar y ejecutar al menos tres escenarios experimentales que midan el costo del ETL según el volumen de datos, la eficacia de las reglas de calidad y la coincidencia de los indicadores entre SQL y Power BI.</w:t>
+        <w:t xml:space="preserve">Diseñar y ejecutar un experimento que identifique los factores asociados a la no-llegada y su evolución en 2026, validado con escenarios de rendimiento del ETL, eficacia de las reglas de calidad y coincidencia de los indicadores entre SQL y Power BI.</w:t>
       </w:r>
     </w:p>
     <w:p>
@@ -3013,7 +3013,7 @@
           <w:sz w:val="19"/>
           <w:lang w:val="es-PE"/>
         </w:rPr>
-        <w:t xml:space="preserve">Big Data se refiere a conjuntos de datos cuyo volumen, velocidad o variedad superan la capacidad de las herramientas tradicionales de una sola máquina y requieren almacenamiento y procesamiento distribuido. En este proyecto se evaluó si esa condición se cumple: el volumen operativo (9 036 estadías en tres años, alrededor de 2 MB) es estructurado, llega por lotes y se procesa en una sola instancia de SQL Server en menos de 4 segundos, incluso al duplicarlo a 15 000 estadías (capítulo VI). Por ello, el alcance de esta entrega se centra en la solución de Inteligencia de Negocios; el uso de procesamiento distribuido queda como recomendación para un escenario con varias sedes o varios años de historia adicional.</w:t>
+        <w:t xml:space="preserve">Big Data se refiere a conjuntos de datos cuyo volumen, velocidad o variedad superan la capacidad de las herramientas tradicionales de una sola máquina y requieren almacenamiento y procesamiento distribuido. En este proyecto se evaluó si esa condición se cumple: el volumen operativo (9 036 estadías en casi tres años, alrededor de 1 MB en archivos planos y 5 MB en la base) es estructurado, llega por lotes y se procesa en una sola instancia de SQL Server en 2.5 segundos, y en 3.5 segundos con 15 000 estadías (capítulo VI). Por ello, el alcance de esta entrega se centra en la solución de Inteligencia de Negocios; el uso de procesamiento distribuido queda como recomendación para un escenario con varias sedes o varios años de historia adicional.</w:t>
       </w:r>
     </w:p>
     <w:p>
@@ -6208,7 +6208,7 @@
           <w:sz w:val="19"/>
           <w:lang w:val="es-PE"/>
         </w:rPr>
-        <w:t xml:space="preserve">No aplica: de acuerdo con el alcance definido para esta entrega, el proyecto desarrolla únicamente la solución de Inteligencia de Negocios. El volumen actual (9 036 estadías, alrededor de 2 MB) se procesa en una sola instancia de SQL Server en menos de 4 segundos (capítulo VI), por lo que no se requiere procesamiento distribuido.</w:t>
+        <w:t xml:space="preserve">No aplica. De acuerdo con el alcance definido para esta entrega, el proyecto desarrolla únicamente la solución de Inteligencia de Negocios. Además, el volumen no exige procesamiento distribuido: el sistema acumula 9 036 estadías en casi tres años (alrededor de 1 MB en archivos planos y 5 MB en la base operativa), son datos estructurados que llegan por lotes, y el ETL los procesa en una sola instancia de SQL Server en 2.5 segundos; incluso con 15 000 estadías tarda 3.5 segundos (sección 6.3).</w:t>
       </w:r>
     </w:p>
     <w:p>
@@ -6232,7 +6232,7 @@
           <w:sz w:val="19"/>
           <w:lang w:val="es-PE"/>
         </w:rPr>
-        <w:t xml:space="preserve">No aplica: de acuerdo con el alcance definido para esta entrega, el proyecto desarrolla únicamente la solución de Inteligencia de Negocios. El volumen actual (9 036 estadías, alrededor de 2 MB) se procesa en una sola instancia de SQL Server en menos de 4 segundos (capítulo VI), por lo que no se requiere procesamiento distribuido.</w:t>
+        <w:t xml:space="preserve">No aplica (ver 3.5.1). La arquitectura de la solución se describe en la sección 3.3.</w:t>
       </w:r>
     </w:p>
     <w:p>
@@ -6256,7 +6256,7 @@
           <w:sz w:val="19"/>
           <w:lang w:val="es-PE"/>
         </w:rPr>
-        <w:t xml:space="preserve">No aplica: de acuerdo con el alcance definido para esta entrega, el proyecto desarrolla únicamente la solución de Inteligencia de Negocios. El volumen actual (9 036 estadías, alrededor de 2 MB) se procesa en una sola instancia de SQL Server en menos de 4 segundos (capítulo VI), por lo que no se requiere procesamiento distribuido.</w:t>
+        <w:t xml:space="preserve">No aplica (ver 3.5.1). El modelo de datos de la solución es el esquema estrella de la sección 3.4.2.</w:t>
       </w:r>
     </w:p>
     <w:p>
@@ -6280,7 +6280,7 @@
           <w:sz w:val="19"/>
           <w:lang w:val="es-PE"/>
         </w:rPr>
-        <w:t xml:space="preserve">No aplica: de acuerdo con el alcance definido para esta entrega, el proyecto desarrolla únicamente la solución de Inteligencia de Negocios. El volumen actual (9 036 estadías, alrededor de 2 MB) se procesa en una sola instancia de SQL Server en menos de 4 segundos (capítulo VI), por lo que no se requiere procesamiento distribuido.</w:t>
+        <w:t xml:space="preserve">No aplica (ver 3.5.1). La escalabilidad del proceso ETL se evaluó con lotes de 500 a 15 000 estadías (EXP-02, sección 6.3), y la resiliencia con el control de errores del ETL (sección 3.4.3).</w:t>
       </w:r>
     </w:p>
     <w:p>
@@ -6304,7 +6304,7 @@
           <w:sz w:val="19"/>
           <w:lang w:val="es-PE"/>
         </w:rPr>
-        <w:t xml:space="preserve">No aplica: de acuerdo con el alcance definido para esta entrega, el proyecto desarrolla únicamente la solución de Inteligencia de Negocios. El volumen actual (9 036 estadías, alrededor de 2 MB) se procesa en una sola instancia de SQL Server en menos de 4 segundos (capítulo VI), por lo que no se requiere procesamiento distribuido.</w:t>
+        <w:t xml:space="preserve">No aplica (ver 3.5.1). Los resultados de la solución se presentan en el capítulo VI.</w:t>
       </w:r>
     </w:p>
     <w:p>
@@ -6583,14 +6583,14 @@
           <w:sz w:val="19"/>
           <w:lang w:val="es-PE"/>
         </w:rPr>
-        <w:t xml:space="preserve">Pregunta experimental: </w:t>
+        <w:t xml:space="preserve">Pregunta experimental principal: </w:t>
       </w:r>
       <w:r>
         <w:rPr>
           <w:sz w:val="19"/>
           <w:lang w:val="es-PE"/>
         </w:rPr>
-        <w:t xml:space="preserve">¿cómo varían el tiempo, el CPU y las lecturas del proceso ETL al aumentar el volumen de estadías; detectan las reglas de calidad los registros defectuosos sin afectar los válidos; y coinciden los indicadores calculados en SQL y en Power BI?</w:t>
+        <w:t xml:space="preserve">¿qué características de la reserva —zona de origen del cliente, método de pago, categoría de habitación, tamaño del grupo y cliente nuevo o recurrente— están asociadas a la no-llegada de huéspedes, y explica su evolución la caída de reservas de 2026 frente a 2024–2025?</w:t>
       </w:r>
     </w:p>
     <w:p>
@@ -6614,7 +6614,7 @@
           <w:sz w:val="19"/>
           <w:lang w:val="es-PE"/>
         </w:rPr>
-        <w:t xml:space="preserve">evaluar el costo, la confiabilidad y la exactitud de la solución BI (relación con OE-01, OE-02, OE-03 y OE-04).</w:t>
+        <w:t xml:space="preserve">identificar los segmentos de mayor no-llegada y verificar que la solución BI produce ese resultado de forma confiable, escalable y exacta (relación con el objetivo general y con OE-01 a OE-04).</w:t>
       </w:r>
     </w:p>
     <w:p>
@@ -6636,14 +6636,30 @@
           <w:sz w:val="19"/>
           <w:lang w:val="es-PE"/>
         </w:rPr>
-        <w:t xml:space="preserve">H1 (rendimiento). </w:t>
+        <w:t xml:space="preserve">H1 (principal, negocio). </w:t>
       </w:r>
       <w:r>
         <w:rPr>
           <w:sz w:val="19"/>
           <w:lang w:val="es-PE"/>
         </w:rPr>
-        <w:t xml:space="preserve">El costo del ETL crece de forma aproximadamente lineal con el volumen y se mantiene por debajo de 5 segundos hasta 15 000 estadías.</w:t>
+        <w:t xml:space="preserve">La tasa de no-llegada difiere en al menos 10 puntos porcentuales entre el segmento de mayor y el de menor riesgo, y en 2026 aumenta la participación de los segmentos de mayor riesgo respecto a 2024–2025.</w:t>
+      </w:r>
+    </w:p>
+    <w:p>
+      <w:pPr>
+        <w:spacing w:after="100"/>
+        <w:jc w:val="both"/>
+        <w:rPr>
+          <w:lang w:val="es-PE"/>
+        </w:rPr>
+      </w:pPr>
+      <w:r>
+        <w:rPr>
+          <w:sz w:val="19"/>
+          <w:lang w:val="es-PE"/>
+        </w:rPr>
+        <w:t xml:space="preserve">Para que la respuesta a la pregunta principal sea confiable, se plantean tres hipótesis de apoyo sobre la solución que la produce:</w:t>
       </w:r>
     </w:p>
     <w:p>
@@ -6665,14 +6681,14 @@
           <w:sz w:val="19"/>
           <w:lang w:val="es-PE"/>
         </w:rPr>
-        <w:t xml:space="preserve">H2 (calidad). </w:t>
+        <w:t xml:space="preserve">H2 (rendimiento). </w:t>
       </w:r>
       <w:r>
         <w:rPr>
           <w:sz w:val="19"/>
           <w:lang w:val="es-PE"/>
         </w:rPr>
-        <w:t xml:space="preserve">Las reglas de calidad detectan el 100 % de los registros defectuosos inyectados, sin descartar registros válidos, y un archivo faltante queda registrado como error sin detener el proceso.</w:t>
+        <w:t xml:space="preserve">El costo del ETL crece de forma aproximadamente lineal con el volumen y se mantiene por debajo de 5 segundos hasta 15 000 estadías.</w:t>
       </w:r>
     </w:p>
     <w:p>
@@ -6694,7 +6710,36 @@
           <w:sz w:val="19"/>
           <w:lang w:val="es-PE"/>
         </w:rPr>
-        <w:t xml:space="preserve">H3 (exactitud). </w:t>
+        <w:t xml:space="preserve">H3 (calidad). </w:t>
+      </w:r>
+      <w:r>
+        <w:rPr>
+          <w:sz w:val="19"/>
+          <w:lang w:val="es-PE"/>
+        </w:rPr>
+        <w:t xml:space="preserve">Las reglas de calidad detectan el 100 % de los registros defectuosos inyectados, sin descartar registros válidos, de modo que los errores de datos no distorsionen las tasas de no-llegada.</w:t>
+      </w:r>
+    </w:p>
+    <w:p>
+      <w:pPr>
+        <w:pStyle w:val="ListParagraph"/>
+        <w:numPr>
+          <w:ilvl w:val="0"/>
+          <w:numId w:val="4"/>
+        </w:numPr>
+        <w:spacing w:after="60"/>
+        <w:jc w:val="both"/>
+        <w:rPr>
+          <w:lang w:val="es-PE"/>
+        </w:rPr>
+      </w:pPr>
+      <w:r>
+        <w:rPr>
+          <w:b/>
+          <w:sz w:val="19"/>
+          <w:lang w:val="es-PE"/>
+        </w:rPr>
+        <w:t xml:space="preserve">H4 (exactitud). </w:t>
       </w:r>
       <w:r>
         <w:rPr>
@@ -7314,7 +7359,7 @@
                 <w:color w:val="000000"/>
                 <w:sz w:val="15"/>
               </w:rPr>
-              <w:t xml:space="preserve">EXP-01 y EXP-02</w:t>
+              <w:t xml:space="preserve">EXP-02 y EXP-03</w:t>
             </w:r>
           </w:p>
         </w:tc>
@@ -7540,7 +7585,7 @@
                 <w:color w:val="000000"/>
                 <w:sz w:val="16"/>
               </w:rPr>
-              <w:t xml:space="preserve">Independiente</w:t>
+              <w:t xml:space="preserve">Independiente (EXP-01)</w:t>
             </w:r>
           </w:p>
         </w:tc>
@@ -7564,7 +7609,7 @@
                 <w:color w:val="000000"/>
                 <w:sz w:val="16"/>
               </w:rPr>
-              <w:t xml:space="preserve">Volumen de estadías (EXP-01); tipo de entrada: limpia, con defectos o con archivo faltante (EXP-02)</w:t>
+              <w:t xml:space="preserve">Segmento de la reserva (zona de origen, método de pago, categoría, tamaño del grupo, tipo de cliente) y periodo (2024–2025 frente a 2026)</w:t>
             </w:r>
           </w:p>
         </w:tc>
@@ -7588,7 +7633,7 @@
                 <w:color w:val="000000"/>
                 <w:sz w:val="16"/>
               </w:rPr>
-              <w:t xml:space="preserve">Filas; escenario de entrada</w:t>
+              <w:t xml:space="preserve">Categorías de cada dimensión del datamart</w:t>
             </w:r>
           </w:p>
         </w:tc>
@@ -7612,7 +7657,7 @@
                 <w:color w:val="000000"/>
                 <w:sz w:val="16"/>
               </w:rPr>
-              <w:t xml:space="preserve">Se prepara el archivo antes de cada corrida</w:t>
+              <w:t xml:space="preserve">Filtros de dimensión en hotel_dw y Power BI</w:t>
             </w:r>
           </w:p>
         </w:tc>
@@ -7636,7 +7681,7 @@
                 <w:color w:val="000000"/>
                 <w:sz w:val="16"/>
               </w:rPr>
-              <w:t xml:space="preserve">500, 1 500, 3 000, 5 000, 8 000, 9 036 y 15 000; 3 escenarios de calidad</w:t>
+              <w:t xml:space="preserve">Todos los segmentos y periodos</w:t>
             </w:r>
           </w:p>
         </w:tc>
@@ -7665,7 +7710,7 @@
                 <w:color w:val="000000"/>
                 <w:sz w:val="16"/>
               </w:rPr>
-              <w:t xml:space="preserve">Dependiente</w:t>
+              <w:t xml:space="preserve">Dependiente (EXP-01)</w:t>
             </w:r>
           </w:p>
         </w:tc>
@@ -7689,7 +7734,7 @@
                 <w:color w:val="000000"/>
                 <w:sz w:val="16"/>
               </w:rPr>
-              <w:t xml:space="preserve">Duración, CPU y lecturas del ETL; registros detectados por las reglas; estado de cada paso</w:t>
+              <w:t xml:space="preserve">Tasa de no-llegada; participación del segmento en las reservas</w:t>
             </w:r>
           </w:p>
         </w:tc>
@@ -7713,7 +7758,7 @@
                 <w:color w:val="000000"/>
                 <w:sz w:val="16"/>
               </w:rPr>
-              <w:t xml:space="preserve">ms; páginas de 8 KB; filas/s; registros</w:t>
+              <w:t xml:space="preserve">% = (canceladas + no-show) / reservas × 100; puntos porcentuales</w:t>
             </w:r>
           </w:p>
         </w:tc>
@@ -7737,7 +7782,7 @@
                 <w:color w:val="000000"/>
                 <w:sz w:val="16"/>
               </w:rPr>
-              <w:t xml:space="preserve">Tablas etl_log y etl_calidad</w:t>
+              <w:t xml:space="preserve">Consultas SQL y medidas DAX</w:t>
             </w:r>
           </w:p>
         </w:tc>
@@ -7761,7 +7806,7 @@
                 <w:color w:val="000000"/>
                 <w:sz w:val="16"/>
               </w:rPr>
-              <w:t xml:space="preserve">ETL &lt; 5 s; 100 % de defectos detectados</w:t>
+              <w:t xml:space="preserve">Brecha ≥ 10 pp entre segmentos</w:t>
             </w:r>
           </w:p>
         </w:tc>
@@ -7790,7 +7835,7 @@
                 <w:color w:val="000000"/>
                 <w:sz w:val="16"/>
               </w:rPr>
-              <w:t xml:space="preserve">Control</w:t>
+              <w:t xml:space="preserve">Dependiente (EXP-02 a EXP-04)</w:t>
             </w:r>
           </w:p>
         </w:tc>
@@ -7814,7 +7859,7 @@
                 <w:color w:val="000000"/>
                 <w:sz w:val="16"/>
               </w:rPr>
-              <w:t xml:space="preserve">Hardware, edición de SQL Server, scripts, datos base</w:t>
+              <w:t xml:space="preserve">Duración, CPU y lecturas del ETL; registros detectados por las reglas; coincidencia SQL–Power BI</w:t>
             </w:r>
           </w:p>
         </w:tc>
@@ -7838,7 +7883,7 @@
                 <w:color w:val="000000"/>
                 <w:sz w:val="16"/>
               </w:rPr>
-              <w:t xml:space="preserve">Valores fijos de la tabla 4.4</w:t>
+              <w:t xml:space="preserve">ms; páginas de 8 KB; registros; diferencia</w:t>
             </w:r>
           </w:p>
         </w:tc>
@@ -7862,7 +7907,7 @@
                 <w:color w:val="000000"/>
                 <w:sz w:val="16"/>
               </w:rPr>
-              <w:t xml:space="preserve">Mismo equipo, bases temporales, 3 repeticiones por nivel</w:t>
+              <w:t xml:space="preserve">Tablas etl_log y etl_calidad; tarjetas del dashboard</w:t>
             </w:r>
           </w:p>
         </w:tc>
@@ -7886,7 +7931,7 @@
                 <w:color w:val="000000"/>
                 <w:sz w:val="16"/>
               </w:rPr>
-              <w:t xml:space="preserve">Variación entre repeticiones &lt; 30 %</w:t>
+              <w:t xml:space="preserve">ETL &lt; 5 s; 100 % de defectos detectados; diferencia 0</w:t>
             </w:r>
           </w:p>
         </w:tc>
@@ -7915,7 +7960,7 @@
                 <w:color w:val="000000"/>
                 <w:sz w:val="16"/>
               </w:rPr>
-              <w:t xml:space="preserve">Negocio</w:t>
+              <w:t xml:space="preserve">Control</w:t>
             </w:r>
           </w:p>
         </w:tc>
@@ -7939,7 +7984,7 @@
                 <w:color w:val="000000"/>
                 <w:sz w:val="16"/>
               </w:rPr>
-              <w:t xml:space="preserve">Coincidencia de indicadores SQL vs. Power BI; brecha de no-llegada entre segmentos</w:t>
+              <w:t xml:space="preserve">Definición de no-llegada; corte al 23/10/2026; hardware y scripts</w:t>
             </w:r>
           </w:p>
         </w:tc>
@@ -7963,7 +8008,7 @@
                 <w:color w:val="000000"/>
                 <w:sz w:val="16"/>
               </w:rPr>
-              <w:t xml:space="preserve">Valor del indicador; puntos porcentuales</w:t>
+              <w:t xml:space="preserve">Solo llegadas ya vencidas para las tasas; valores fijos de la tabla 4.4</w:t>
             </w:r>
           </w:p>
         </w:tc>
@@ -7987,7 +8032,7 @@
                 <w:color w:val="000000"/>
                 <w:sz w:val="16"/>
               </w:rPr>
-              <w:t xml:space="preserve">Consultas SQL y tarjetas del dashboard</w:t>
+              <w:t xml:space="preserve">Mismo equipo, bases temporales, 3 repeticiones por nivel</w:t>
             </w:r>
           </w:p>
         </w:tc>
@@ -8011,7 +8056,7 @@
                 <w:color w:val="000000"/>
                 <w:sz w:val="16"/>
               </w:rPr>
-              <w:t xml:space="preserve">Diferencia 0; brecha ≥ 10 pp</w:t>
+              <w:t xml:space="preserve">Variación entre repeticiones &lt; 30 %</w:t>
             </w:r>
           </w:p>
         </w:tc>
@@ -8914,7 +8959,7 @@
           <w:sz w:val="19"/>
           <w:lang w:val="es-PE"/>
         </w:rPr>
-        <w:t xml:space="preserve">Se definen tres escenarios; las mediciones de rendimiento se repiten tres veces por nivel y se reporta la media y el rango.</w:t>
+        <w:t xml:space="preserve">Se definen cuatro escenarios: el principal responde la pregunta de negocio y los otros tres validan la solución que produce ese resultado. Las mediciones de rendimiento se repiten tres veces por nivel.</w:t>
       </w:r>
     </w:p>
     <w:tbl>
@@ -9177,7 +9222,7 @@
                 <w:color w:val="000000"/>
                 <w:sz w:val="15"/>
               </w:rPr>
-              <w:t xml:space="preserve">BI (ETL)</w:t>
+              <w:t xml:space="preserve">BI (negocio)</w:t>
             </w:r>
           </w:p>
         </w:tc>
@@ -9201,7 +9246,7 @@
                 <w:color w:val="000000"/>
                 <w:sz w:val="15"/>
               </w:rPr>
-              <w:t xml:space="preserve">ETL completo con lotes crecientes de estadías</w:t>
+              <w:t xml:space="preserve">Tasa de no-llegada por segmento y por periodo (2024–2025 frente a 2026)</w:t>
             </w:r>
           </w:p>
         </w:tc>
@@ -9225,7 +9270,7 @@
                 <w:color w:val="000000"/>
                 <w:sz w:val="15"/>
               </w:rPr>
-              <w:t xml:space="preserve">500, 1 500, 3 000, 5 000, 8 000, 9 036 y 15 000 estadías</w:t>
+              <w:t xml:space="preserve">hotel_dw: 9 036 estadías, llegadas hasta el 23/10/2026</w:t>
             </w:r>
           </w:p>
         </w:tc>
@@ -9249,7 +9294,7 @@
                 <w:color w:val="000000"/>
                 <w:sz w:val="15"/>
               </w:rPr>
-              <w:t xml:space="preserve">Duración, CPU y lecturas (etl_log); filas/s</w:t>
+              <w:t xml:space="preserve">% no-llegada; brecha en pp; participación del segmento</w:t>
             </w:r>
           </w:p>
         </w:tc>
@@ -9273,7 +9318,7 @@
                 <w:color w:val="000000"/>
                 <w:sz w:val="15"/>
               </w:rPr>
-              <w:t xml:space="preserve">Mismo equipo y scripts; 3 repeticiones</w:t>
+              <w:t xml:space="preserve">Misma definición de no-llegada en SQL y DAX</w:t>
             </w:r>
           </w:p>
         </w:tc>
@@ -9297,7 +9342,7 @@
                 <w:color w:val="000000"/>
                 <w:sz w:val="15"/>
               </w:rPr>
-              <w:t xml:space="preserve">Crecimiento casi lineal; &lt; 5 s con 15 000</w:t>
+              <w:t xml:space="preserve">Brecha ≥ 10 pp; crecen los segmentos de riesgo en 2026</w:t>
             </w:r>
           </w:p>
         </w:tc>
@@ -9350,7 +9395,7 @@
                 <w:color w:val="000000"/>
                 <w:sz w:val="15"/>
               </w:rPr>
-              <w:t xml:space="preserve">BI (calidad)</w:t>
+              <w:t xml:space="preserve">BI (rendimiento)</w:t>
             </w:r>
           </w:p>
         </w:tc>
@@ -9374,7 +9419,7 @@
                 <w:color w:val="000000"/>
                 <w:sz w:val="15"/>
               </w:rPr>
-              <w:t xml:space="preserve">ETL con datos limpios, con 10 registros defectuosos y con un archivo faltante</w:t>
+              <w:t xml:space="preserve">ETL completo con lotes crecientes de estadías</w:t>
             </w:r>
           </w:p>
         </w:tc>
@@ -9398,7 +9443,7 @@
                 <w:color w:val="000000"/>
                 <w:sz w:val="15"/>
               </w:rPr>
-              <w:t xml:space="preserve">9 036 estadías + defectos inyectados</w:t>
+              <w:t xml:space="preserve">500, 1 500, 3 000, 5 000, 8 000, 9 036 y 15 000 estadías</w:t>
             </w:r>
           </w:p>
         </w:tc>
@@ -9422,7 +9467,7 @@
                 <w:color w:val="000000"/>
                 <w:sz w:val="15"/>
               </w:rPr>
-              <w:t xml:space="preserve">Registros detectados (etl_calidad); estado por paso (etl_log)</w:t>
+              <w:t xml:space="preserve">Duración, CPU y lecturas (etl_log); filas/s</w:t>
             </w:r>
           </w:p>
         </w:tc>
@@ -9446,7 +9491,7 @@
                 <w:color w:val="000000"/>
                 <w:sz w:val="15"/>
               </w:rPr>
-              <w:t xml:space="preserve">Mismos datos base</w:t>
+              <w:t xml:space="preserve">Mismo equipo y scripts; 3 repeticiones</w:t>
             </w:r>
           </w:p>
         </w:tc>
@@ -9470,7 +9515,7 @@
                 <w:color w:val="000000"/>
                 <w:sz w:val="15"/>
               </w:rPr>
-              <w:t xml:space="preserve">100 % de defectos detectados; error registrado sin detener el ETL</w:t>
+              <w:t xml:space="preserve">Crecimiento casi lineal; &lt; 5 s con 15 000</w:t>
             </w:r>
           </w:p>
         </w:tc>
@@ -9500,6 +9545,179 @@
                 <w:sz w:val="15"/>
               </w:rPr>
               <w:t xml:space="preserve">EXP-03</w:t>
+            </w:r>
+          </w:p>
+        </w:tc>
+        <w:tc>
+          <w:tcPr>
+            <w:tcW w:w="1100" w:type="dxa"/>
+            <w:tcMar>
+              <w:top w:w="80" w:type="dxa"/>
+              <w:left w:w="120" w:type="dxa"/>
+              <w:bottom w:w="80" w:type="dxa"/>
+              <w:right w:w="120" w:type="dxa"/>
+            </w:tcMar>
+            <w:vAlign w:val="center"/>
+          </w:tcPr>
+          <w:p>
+            <w:pPr>
+              <w:spacing w:after="40" w:line="259" w:lineRule="auto"/>
+            </w:pPr>
+            <w:r>
+              <w:rPr>
+                <w:color w:val="000000"/>
+                <w:sz w:val="15"/>
+              </w:rPr>
+              <w:t xml:space="preserve">BI (calidad)</w:t>
+            </w:r>
+          </w:p>
+        </w:tc>
+        <w:tc>
+          <w:tcPr>
+            <w:tcW w:w="1700" w:type="dxa"/>
+            <w:tcMar>
+              <w:top w:w="80" w:type="dxa"/>
+              <w:left w:w="120" w:type="dxa"/>
+              <w:bottom w:w="80" w:type="dxa"/>
+              <w:right w:w="120" w:type="dxa"/>
+            </w:tcMar>
+            <w:vAlign w:val="center"/>
+          </w:tcPr>
+          <w:p>
+            <w:pPr>
+              <w:spacing w:after="40" w:line="259" w:lineRule="auto"/>
+            </w:pPr>
+            <w:r>
+              <w:rPr>
+                <w:color w:val="000000"/>
+                <w:sz w:val="15"/>
+              </w:rPr>
+              <w:t xml:space="preserve">ETL con datos limpios, con registros defectuosos y con un archivo faltante</w:t>
+            </w:r>
+          </w:p>
+        </w:tc>
+        <w:tc>
+          <w:tcPr>
+            <w:tcW w:w="1250" w:type="dxa"/>
+            <w:tcMar>
+              <w:top w:w="80" w:type="dxa"/>
+              <w:left w:w="120" w:type="dxa"/>
+              <w:bottom w:w="80" w:type="dxa"/>
+              <w:right w:w="120" w:type="dxa"/>
+            </w:tcMar>
+            <w:vAlign w:val="center"/>
+          </w:tcPr>
+          <w:p>
+            <w:pPr>
+              <w:spacing w:after="40" w:line="259" w:lineRule="auto"/>
+            </w:pPr>
+            <w:r>
+              <w:rPr>
+                <w:color w:val="000000"/>
+                <w:sz w:val="15"/>
+              </w:rPr>
+              <w:t xml:space="preserve">9 036 estadías + defectos inyectados</w:t>
+            </w:r>
+          </w:p>
+        </w:tc>
+        <w:tc>
+          <w:tcPr>
+            <w:tcW w:w="1250" w:type="dxa"/>
+            <w:tcMar>
+              <w:top w:w="80" w:type="dxa"/>
+              <w:left w:w="120" w:type="dxa"/>
+              <w:bottom w:w="80" w:type="dxa"/>
+              <w:right w:w="120" w:type="dxa"/>
+            </w:tcMar>
+            <w:vAlign w:val="center"/>
+          </w:tcPr>
+          <w:p>
+            <w:pPr>
+              <w:spacing w:after="40" w:line="259" w:lineRule="auto"/>
+            </w:pPr>
+            <w:r>
+              <w:rPr>
+                <w:color w:val="000000"/>
+                <w:sz w:val="15"/>
+              </w:rPr>
+              <w:t xml:space="preserve">Registros detectados (etl_calidad); estado por paso (etl_log)</w:t>
+            </w:r>
+          </w:p>
+        </w:tc>
+        <w:tc>
+          <w:tcPr>
+            <w:tcW w:w="1150" w:type="dxa"/>
+            <w:tcMar>
+              <w:top w:w="80" w:type="dxa"/>
+              <w:left w:w="120" w:type="dxa"/>
+              <w:bottom w:w="80" w:type="dxa"/>
+              <w:right w:w="120" w:type="dxa"/>
+            </w:tcMar>
+            <w:vAlign w:val="center"/>
+          </w:tcPr>
+          <w:p>
+            <w:pPr>
+              <w:spacing w:after="40" w:line="259" w:lineRule="auto"/>
+            </w:pPr>
+            <w:r>
+              <w:rPr>
+                <w:color w:val="000000"/>
+                <w:sz w:val="15"/>
+              </w:rPr>
+              <w:t xml:space="preserve">Mismos datos base</w:t>
+            </w:r>
+          </w:p>
+        </w:tc>
+        <w:tc>
+          <w:tcPr>
+            <w:tcW w:w="1200" w:type="dxa"/>
+            <w:tcMar>
+              <w:top w:w="80" w:type="dxa"/>
+              <w:left w:w="120" w:type="dxa"/>
+              <w:bottom w:w="80" w:type="dxa"/>
+              <w:right w:w="120" w:type="dxa"/>
+            </w:tcMar>
+            <w:vAlign w:val="center"/>
+          </w:tcPr>
+          <w:p>
+            <w:pPr>
+              <w:spacing w:after="40" w:line="259" w:lineRule="auto"/>
+            </w:pPr>
+            <w:r>
+              <w:rPr>
+                <w:color w:val="000000"/>
+                <w:sz w:val="15"/>
+              </w:rPr>
+              <w:t xml:space="preserve">100 % de defectos detectados; error registrado sin detener el ETL</w:t>
+            </w:r>
+          </w:p>
+        </w:tc>
+      </w:tr>
+      <w:tr>
+        <w:trPr>
+          <w:cantSplit/>
+        </w:trPr>
+        <w:tc>
+          <w:tcPr>
+            <w:tcW w:w="750" w:type="dxa"/>
+            <w:tcMar>
+              <w:top w:w="80" w:type="dxa"/>
+              <w:left w:w="120" w:type="dxa"/>
+              <w:bottom w:w="80" w:type="dxa"/>
+              <w:right w:w="120" w:type="dxa"/>
+            </w:tcMar>
+            <w:vAlign w:val="center"/>
+          </w:tcPr>
+          <w:p>
+            <w:pPr>
+              <w:spacing w:after="40" w:line="259" w:lineRule="auto"/>
+            </w:pPr>
+            <w:r>
+              <w:rPr>
+                <w:color w:val="000000"/>
+                <w:sz w:val="15"/>
+              </w:rPr>
+              <w:t xml:space="preserve">EXP-04</w:t>
             </w:r>
           </w:p>
         </w:tc>
@@ -9704,7 +9922,7 @@
           <w:sz w:val="19"/>
           <w:lang w:val="es-PE"/>
         </w:rPr>
-        <w:t xml:space="preserve">Ejecutar bd/respaldo_bd_actual.sql y verificar el conteo de filas que el script muestra al final.</w:t>
+        <w:t xml:space="preserve">Ejecutar bd/respaldo_bd_actual.sql, copiar bi/fuentes/ en C:\txt\tunki\ y ejecutar bi/crear_datamart.sql y bi/ETL_CARGA.sql.</w:t>
       </w:r>
     </w:p>
     <w:p>
@@ -9725,7 +9943,7 @@
           <w:sz w:val="19"/>
           <w:lang w:val="es-PE"/>
         </w:rPr>
-        <w:t xml:space="preserve">Copiar bi/fuentes/ en C:\txt\tunki\, ejecutar bi/crear_datamart.sql y luego bi/ETL_CARGA.sql.</w:t>
+        <w:t xml:space="preserve">EXP-01: calcular la tasa de no-llegada por segmento y por periodo en hotel_dw y en Power BI (página "Factores de no-llegada", filtro de año).</w:t>
       </w:r>
     </w:p>
     <w:p>
@@ -9746,7 +9964,7 @@
           <w:sz w:val="19"/>
           <w:lang w:val="es-PE"/>
         </w:rPr>
-        <w:t xml:space="preserve">EXP-01: preparar cada lote de estadías y ejecutar el ETL tres veces por lote, sin otras cargas en el equipo.</w:t>
+        <w:t xml:space="preserve">EXP-02: preparar cada lote de estadías y ejecutar el ETL tres veces por lote, sin otras cargas en el equipo.</w:t>
       </w:r>
     </w:p>
     <w:p>
@@ -9767,7 +9985,7 @@
           <w:sz w:val="19"/>
           <w:lang w:val="es-PE"/>
         </w:rPr>
-        <w:t xml:space="preserve">EXP-02: ejecutar el ETL con el archivo limpio, con los registros defectuosos agregados y sin consumos.txt.</w:t>
+        <w:t xml:space="preserve">EXP-03: ejecutar el ETL con el archivo limpio, con los registros defectuosos agregados y sin consumos.txt.</w:t>
       </w:r>
     </w:p>
     <w:p>
@@ -9788,7 +10006,7 @@
           <w:sz w:val="19"/>
           <w:lang w:val="es-PE"/>
         </w:rPr>
-        <w:t xml:space="preserve">Consultar etl_log y etl_calidad; consolidar media y rango por escenario.</w:t>
+        <w:t xml:space="preserve">EXP-04: comparar los indicadores de las consultas SQL con las tarjetas del dashboard.</w:t>
       </w:r>
     </w:p>
     <w:p>
@@ -9809,7 +10027,7 @@
           <w:sz w:val="19"/>
           <w:lang w:val="es-PE"/>
         </w:rPr>
-        <w:t xml:space="preserve">EXP-03: comparar los indicadores de las consultas SQL con las tarjetas del dashboard y registrar desviaciones.</w:t>
+        <w:t xml:space="preserve">Consolidar resultados (media y rango) y contrastarlos con H1 a H4; registrar desviaciones.</w:t>
       </w:r>
     </w:p>
     <w:p>
@@ -10150,7 +10368,7 @@
           <w:sz w:val="19"/>
           <w:lang w:val="es-PE"/>
         </w:rPr>
-        <w:t xml:space="preserve">No aplica: de acuerdo con el alcance definido para esta entrega, el proyecto desarrolla únicamente la solución de Inteligencia de Negocios. El volumen actual (9 036 estadías, alrededor de 2 MB) se procesa en una sola instancia de SQL Server en menos de 4 segundos (capítulo VI), por lo que no se requiere procesamiento distribuido.</w:t>
+        <w:t xml:space="preserve">No aplica: el alcance de esta entrega es la solución de Inteligencia de Negocios (ver 3.5.1).</w:t>
       </w:r>
     </w:p>
     <w:p>
@@ -12056,7 +12274,7 @@
                 <w:color w:val="000000"/>
                 <w:sz w:val="16"/>
               </w:rPr>
-              <w:t xml:space="preserve">Se ejecutó EXP-01 con esos lotes y se agregó la bitácora etl_log</w:t>
+              <w:t xml:space="preserve">Se ejecutó EXP-02 con esos lotes y se agregó la bitácora etl_log</w:t>
             </w:r>
           </w:p>
         </w:tc>
@@ -14822,7 +15040,7 @@
                 <w:color w:val="000000"/>
                 <w:sz w:val="16"/>
               </w:rPr>
-              <w:t xml:space="preserve">EXP-01</w:t>
+              <w:t xml:space="preserve">EXP-02</w:t>
             </w:r>
           </w:p>
         </w:tc>
@@ -14947,7 +15165,7 @@
                 <w:color w:val="000000"/>
                 <w:sz w:val="16"/>
               </w:rPr>
-              <w:t xml:space="preserve">EXP-02 (limpio)</w:t>
+              <w:t xml:space="preserve">EXP-03 (limpio)</w:t>
             </w:r>
           </w:p>
         </w:tc>
@@ -15072,7 +15290,7 @@
                 <w:color w:val="000000"/>
                 <w:sz w:val="16"/>
               </w:rPr>
-              <w:t xml:space="preserve">EXP-02 (defectos)</w:t>
+              <w:t xml:space="preserve">EXP-03 (defectos)</w:t>
             </w:r>
           </w:p>
         </w:tc>
@@ -15197,7 +15415,7 @@
                 <w:color w:val="000000"/>
                 <w:sz w:val="16"/>
               </w:rPr>
-              <w:t xml:space="preserve">EXP-02 (archivo faltante)</w:t>
+              <w:t xml:space="preserve">EXP-03 (archivo faltante)</w:t>
             </w:r>
           </w:p>
         </w:tc>
@@ -16586,7 +16804,782 @@
           <w:sz w:val="19"/>
           <w:lang w:val="es-PE"/>
         </w:rPr>
-        <w:t xml:space="preserve">EXP-01: media de tres repeticiones por lote (rango entre paréntesis).</w:t>
+        <w:t xml:space="preserve">EXP-01 (principal): tasa de no-llegada por segmento, estadías con llegada hasta el 23/10/2026.</w:t>
+      </w:r>
+    </w:p>
+    <w:tbl>
+      <w:tblPr>
+        <w:tblStyle w:val="TableGrid"/>
+        <w:tblW w:w="8400" w:type="dxa"/>
+        <w:tblInd w:w="120" w:type="dxa"/>
+        <w:tblLayout w:type="fixed"/>
+        <w:tblLook w:val="04A0" w:firstRow="1" w:lastRow="0" w:firstColumn="1" w:lastColumn="0" w:noHBand="0" w:noVBand="1"/>
+      </w:tblPr>
+      <w:tblGrid>
+        <w:gridCol w:w="1700"/>
+        <w:gridCol w:w="2500"/>
+        <w:gridCol w:w="2600"/>
+        <w:gridCol w:w="1600"/>
+      </w:tblGrid>
+      <w:tr>
+        <w:trPr>
+          <w:cantSplit/>
+          <w:tblHeader/>
+        </w:trPr>
+        <w:tc>
+          <w:tcPr>
+            <w:tcW w:w="1700" w:type="dxa"/>
+            <w:shd w:val="clear" w:color="auto" w:fill="E8EEF5"/>
+            <w:tcMar>
+              <w:top w:w="80" w:type="dxa"/>
+              <w:left w:w="120" w:type="dxa"/>
+              <w:bottom w:w="80" w:type="dxa"/>
+              <w:right w:w="120" w:type="dxa"/>
+            </w:tcMar>
+            <w:vAlign w:val="center"/>
+          </w:tcPr>
+          <w:p>
+            <w:pPr>
+              <w:spacing w:after="40" w:line="259" w:lineRule="auto"/>
+              <w:jc w:val="center"/>
+            </w:pPr>
+            <w:r>
+              <w:rPr>
+                <w:b/>
+                <w:color w:val="0B2545"/>
+                <w:sz w:val="17"/>
+              </w:rPr>
+              <w:t xml:space="preserve">FACTOR</w:t>
+            </w:r>
+          </w:p>
+        </w:tc>
+        <w:tc>
+          <w:tcPr>
+            <w:tcW w:w="2500" w:type="dxa"/>
+            <w:shd w:val="clear" w:color="auto" w:fill="E8EEF5"/>
+            <w:tcMar>
+              <w:top w:w="80" w:type="dxa"/>
+              <w:left w:w="120" w:type="dxa"/>
+              <w:bottom w:w="80" w:type="dxa"/>
+              <w:right w:w="120" w:type="dxa"/>
+            </w:tcMar>
+            <w:vAlign w:val="center"/>
+          </w:tcPr>
+          <w:p>
+            <w:pPr>
+              <w:spacing w:after="40" w:line="259" w:lineRule="auto"/>
+              <w:jc w:val="center"/>
+            </w:pPr>
+            <w:r>
+              <w:rPr>
+                <w:b/>
+                <w:color w:val="0B2545"/>
+                <w:sz w:val="17"/>
+              </w:rPr>
+              <w:t xml:space="preserve">MAYOR NO-LLEGADA</w:t>
+            </w:r>
+          </w:p>
+        </w:tc>
+        <w:tc>
+          <w:tcPr>
+            <w:tcW w:w="2600" w:type="dxa"/>
+            <w:shd w:val="clear" w:color="auto" w:fill="E8EEF5"/>
+            <w:tcMar>
+              <w:top w:w="80" w:type="dxa"/>
+              <w:left w:w="120" w:type="dxa"/>
+              <w:bottom w:w="80" w:type="dxa"/>
+              <w:right w:w="120" w:type="dxa"/>
+            </w:tcMar>
+            <w:vAlign w:val="center"/>
+          </w:tcPr>
+          <w:p>
+            <w:pPr>
+              <w:spacing w:after="40" w:line="259" w:lineRule="auto"/>
+              <w:jc w:val="center"/>
+            </w:pPr>
+            <w:r>
+              <w:rPr>
+                <w:b/>
+                <w:color w:val="0B2545"/>
+                <w:sz w:val="17"/>
+              </w:rPr>
+              <w:t xml:space="preserve">MENOR NO-LLEGADA</w:t>
+            </w:r>
+          </w:p>
+        </w:tc>
+        <w:tc>
+          <w:tcPr>
+            <w:tcW w:w="1600" w:type="dxa"/>
+            <w:shd w:val="clear" w:color="auto" w:fill="E8EEF5"/>
+            <w:tcMar>
+              <w:top w:w="80" w:type="dxa"/>
+              <w:left w:w="120" w:type="dxa"/>
+              <w:bottom w:w="80" w:type="dxa"/>
+              <w:right w:w="120" w:type="dxa"/>
+            </w:tcMar>
+            <w:vAlign w:val="center"/>
+          </w:tcPr>
+          <w:p>
+            <w:pPr>
+              <w:spacing w:after="40" w:line="259" w:lineRule="auto"/>
+              <w:jc w:val="center"/>
+            </w:pPr>
+            <w:r>
+              <w:rPr>
+                <w:b/>
+                <w:color w:val="0B2545"/>
+                <w:sz w:val="17"/>
+              </w:rPr>
+              <w:t xml:space="preserve">BRECHA</w:t>
+            </w:r>
+          </w:p>
+        </w:tc>
+      </w:tr>
+      <w:tr>
+        <w:trPr>
+          <w:cantSplit/>
+        </w:trPr>
+        <w:tc>
+          <w:tcPr>
+            <w:tcW w:w="1700" w:type="dxa"/>
+            <w:tcMar>
+              <w:top w:w="80" w:type="dxa"/>
+              <w:left w:w="120" w:type="dxa"/>
+              <w:bottom w:w="80" w:type="dxa"/>
+              <w:right w:w="120" w:type="dxa"/>
+            </w:tcMar>
+            <w:vAlign w:val="center"/>
+          </w:tcPr>
+          <w:p>
+            <w:pPr>
+              <w:spacing w:after="40" w:line="259" w:lineRule="auto"/>
+            </w:pPr>
+            <w:r>
+              <w:rPr>
+                <w:color w:val="000000"/>
+                <w:sz w:val="17"/>
+              </w:rPr>
+              <w:t xml:space="preserve">Zona de origen</w:t>
+            </w:r>
+          </w:p>
+        </w:tc>
+        <w:tc>
+          <w:tcPr>
+            <w:tcW w:w="2500" w:type="dxa"/>
+            <w:tcMar>
+              <w:top w:w="80" w:type="dxa"/>
+              <w:left w:w="120" w:type="dxa"/>
+              <w:bottom w:w="80" w:type="dxa"/>
+              <w:right w:w="120" w:type="dxa"/>
+            </w:tcMar>
+            <w:vAlign w:val="center"/>
+          </w:tcPr>
+          <w:p>
+            <w:pPr>
+              <w:spacing w:after="40" w:line="259" w:lineRule="auto"/>
+            </w:pPr>
+            <w:r>
+              <w:rPr>
+                <w:color w:val="000000"/>
+                <w:sz w:val="17"/>
+              </w:rPr>
+              <w:t xml:space="preserve">Lejana: 15.2 % (Extranjero 14.6 %)</w:t>
+            </w:r>
+          </w:p>
+        </w:tc>
+        <w:tc>
+          <w:tcPr>
+            <w:tcW w:w="2600" w:type="dxa"/>
+            <w:tcMar>
+              <w:top w:w="80" w:type="dxa"/>
+              <w:left w:w="120" w:type="dxa"/>
+              <w:bottom w:w="80" w:type="dxa"/>
+              <w:right w:w="120" w:type="dxa"/>
+            </w:tcMar>
+            <w:vAlign w:val="center"/>
+          </w:tcPr>
+          <w:p>
+            <w:pPr>
+              <w:spacing w:after="40" w:line="259" w:lineRule="auto"/>
+            </w:pPr>
+            <w:r>
+              <w:rPr>
+                <w:color w:val="000000"/>
+                <w:sz w:val="17"/>
+              </w:rPr>
+              <w:t xml:space="preserve">Cercana a Oxapampa: 4.5 % (Lima 8.6 %)</w:t>
+            </w:r>
+          </w:p>
+        </w:tc>
+        <w:tc>
+          <w:tcPr>
+            <w:tcW w:w="1600" w:type="dxa"/>
+            <w:tcMar>
+              <w:top w:w="80" w:type="dxa"/>
+              <w:left w:w="120" w:type="dxa"/>
+              <w:bottom w:w="80" w:type="dxa"/>
+              <w:right w:w="120" w:type="dxa"/>
+            </w:tcMar>
+            <w:vAlign w:val="center"/>
+          </w:tcPr>
+          <w:p>
+            <w:pPr>
+              <w:spacing w:after="40" w:line="259" w:lineRule="auto"/>
+            </w:pPr>
+            <w:r>
+              <w:rPr>
+                <w:color w:val="000000"/>
+                <w:sz w:val="17"/>
+              </w:rPr>
+              <w:t xml:space="preserve">10.7 pp</w:t>
+            </w:r>
+          </w:p>
+        </w:tc>
+      </w:tr>
+      <w:tr>
+        <w:trPr>
+          <w:cantSplit/>
+        </w:trPr>
+        <w:tc>
+          <w:tcPr>
+            <w:tcW w:w="1700" w:type="dxa"/>
+            <w:tcMar>
+              <w:top w:w="80" w:type="dxa"/>
+              <w:left w:w="120" w:type="dxa"/>
+              <w:bottom w:w="80" w:type="dxa"/>
+              <w:right w:w="120" w:type="dxa"/>
+            </w:tcMar>
+            <w:vAlign w:val="center"/>
+          </w:tcPr>
+          <w:p>
+            <w:pPr>
+              <w:spacing w:after="40" w:line="259" w:lineRule="auto"/>
+            </w:pPr>
+            <w:r>
+              <w:rPr>
+                <w:color w:val="000000"/>
+                <w:sz w:val="17"/>
+              </w:rPr>
+              <w:t xml:space="preserve">Método de pago</w:t>
+            </w:r>
+          </w:p>
+        </w:tc>
+        <w:tc>
+          <w:tcPr>
+            <w:tcW w:w="2500" w:type="dxa"/>
+            <w:tcMar>
+              <w:top w:w="80" w:type="dxa"/>
+              <w:left w:w="120" w:type="dxa"/>
+              <w:bottom w:w="80" w:type="dxa"/>
+              <w:right w:w="120" w:type="dxa"/>
+            </w:tcMar>
+            <w:vAlign w:val="center"/>
+          </w:tcPr>
+          <w:p>
+            <w:pPr>
+              <w:spacing w:after="40" w:line="259" w:lineRule="auto"/>
+            </w:pPr>
+            <w:r>
+              <w:rPr>
+                <w:color w:val="000000"/>
+                <w:sz w:val="17"/>
+              </w:rPr>
+              <w:t xml:space="preserve">Efectivo: 13.5 %</w:t>
+            </w:r>
+          </w:p>
+        </w:tc>
+        <w:tc>
+          <w:tcPr>
+            <w:tcW w:w="2600" w:type="dxa"/>
+            <w:tcMar>
+              <w:top w:w="80" w:type="dxa"/>
+              <w:left w:w="120" w:type="dxa"/>
+              <w:bottom w:w="80" w:type="dxa"/>
+              <w:right w:w="120" w:type="dxa"/>
+            </w:tcMar>
+            <w:vAlign w:val="center"/>
+          </w:tcPr>
+          <w:p>
+            <w:pPr>
+              <w:spacing w:after="40" w:line="259" w:lineRule="auto"/>
+            </w:pPr>
+            <w:r>
+              <w:rPr>
+                <w:color w:val="000000"/>
+                <w:sz w:val="17"/>
+              </w:rPr>
+              <w:t xml:space="preserve">Transferencia: 6.8 % (Tarjeta 8.3 %)</w:t>
+            </w:r>
+          </w:p>
+        </w:tc>
+        <w:tc>
+          <w:tcPr>
+            <w:tcW w:w="1600" w:type="dxa"/>
+            <w:tcMar>
+              <w:top w:w="80" w:type="dxa"/>
+              <w:left w:w="120" w:type="dxa"/>
+              <w:bottom w:w="80" w:type="dxa"/>
+              <w:right w:w="120" w:type="dxa"/>
+            </w:tcMar>
+            <w:vAlign w:val="center"/>
+          </w:tcPr>
+          <w:p>
+            <w:pPr>
+              <w:spacing w:after="40" w:line="259" w:lineRule="auto"/>
+            </w:pPr>
+            <w:r>
+              <w:rPr>
+                <w:color w:val="000000"/>
+                <w:sz w:val="17"/>
+              </w:rPr>
+              <w:t xml:space="preserve">6.7 pp</w:t>
+            </w:r>
+          </w:p>
+        </w:tc>
+      </w:tr>
+      <w:tr>
+        <w:trPr>
+          <w:cantSplit/>
+        </w:trPr>
+        <w:tc>
+          <w:tcPr>
+            <w:tcW w:w="1700" w:type="dxa"/>
+            <w:tcMar>
+              <w:top w:w="80" w:type="dxa"/>
+              <w:left w:w="120" w:type="dxa"/>
+              <w:bottom w:w="80" w:type="dxa"/>
+              <w:right w:w="120" w:type="dxa"/>
+            </w:tcMar>
+            <w:vAlign w:val="center"/>
+          </w:tcPr>
+          <w:p>
+            <w:pPr>
+              <w:spacing w:after="40" w:line="259" w:lineRule="auto"/>
+            </w:pPr>
+            <w:r>
+              <w:rPr>
+                <w:color w:val="000000"/>
+                <w:sz w:val="17"/>
+              </w:rPr>
+              <w:t xml:space="preserve">Categoría</w:t>
+            </w:r>
+          </w:p>
+        </w:tc>
+        <w:tc>
+          <w:tcPr>
+            <w:tcW w:w="2500" w:type="dxa"/>
+            <w:tcMar>
+              <w:top w:w="80" w:type="dxa"/>
+              <w:left w:w="120" w:type="dxa"/>
+              <w:bottom w:w="80" w:type="dxa"/>
+              <w:right w:w="120" w:type="dxa"/>
+            </w:tcMar>
+            <w:vAlign w:val="center"/>
+          </w:tcPr>
+          <w:p>
+            <w:pPr>
+              <w:spacing w:after="40" w:line="259" w:lineRule="auto"/>
+            </w:pPr>
+            <w:r>
+              <w:rPr>
+                <w:color w:val="000000"/>
+                <w:sz w:val="17"/>
+              </w:rPr>
+              <w:t xml:space="preserve">Cabaña Bungalow: 15.9 % (Domo Colibrí 14.3 %)</w:t>
+            </w:r>
+          </w:p>
+        </w:tc>
+        <w:tc>
+          <w:tcPr>
+            <w:tcW w:w="2600" w:type="dxa"/>
+            <w:tcMar>
+              <w:top w:w="80" w:type="dxa"/>
+              <w:left w:w="120" w:type="dxa"/>
+              <w:bottom w:w="80" w:type="dxa"/>
+              <w:right w:w="120" w:type="dxa"/>
+            </w:tcMar>
+            <w:vAlign w:val="center"/>
+          </w:tcPr>
+          <w:p>
+            <w:pPr>
+              <w:spacing w:after="40" w:line="259" w:lineRule="auto"/>
+            </w:pPr>
+            <w:r>
+              <w:rPr>
+                <w:color w:val="000000"/>
+                <w:sz w:val="17"/>
+              </w:rPr>
+              <w:t xml:space="preserve">Habitación Matrimonial: 7.0 %</w:t>
+            </w:r>
+          </w:p>
+        </w:tc>
+        <w:tc>
+          <w:tcPr>
+            <w:tcW w:w="1600" w:type="dxa"/>
+            <w:tcMar>
+              <w:top w:w="80" w:type="dxa"/>
+              <w:left w:w="120" w:type="dxa"/>
+              <w:bottom w:w="80" w:type="dxa"/>
+              <w:right w:w="120" w:type="dxa"/>
+            </w:tcMar>
+            <w:vAlign w:val="center"/>
+          </w:tcPr>
+          <w:p>
+            <w:pPr>
+              <w:spacing w:after="40" w:line="259" w:lineRule="auto"/>
+            </w:pPr>
+            <w:r>
+              <w:rPr>
+                <w:color w:val="000000"/>
+                <w:sz w:val="17"/>
+              </w:rPr>
+              <w:t xml:space="preserve">8.9 pp</w:t>
+            </w:r>
+          </w:p>
+        </w:tc>
+      </w:tr>
+      <w:tr>
+        <w:trPr>
+          <w:cantSplit/>
+        </w:trPr>
+        <w:tc>
+          <w:tcPr>
+            <w:tcW w:w="1700" w:type="dxa"/>
+            <w:tcMar>
+              <w:top w:w="80" w:type="dxa"/>
+              <w:left w:w="120" w:type="dxa"/>
+              <w:bottom w:w="80" w:type="dxa"/>
+              <w:right w:w="120" w:type="dxa"/>
+            </w:tcMar>
+            <w:vAlign w:val="center"/>
+          </w:tcPr>
+          <w:p>
+            <w:pPr>
+              <w:spacing w:after="40" w:line="259" w:lineRule="auto"/>
+            </w:pPr>
+            <w:r>
+              <w:rPr>
+                <w:color w:val="000000"/>
+                <w:sz w:val="17"/>
+              </w:rPr>
+              <w:t xml:space="preserve">Tamaño del grupo</w:t>
+            </w:r>
+          </w:p>
+        </w:tc>
+        <w:tc>
+          <w:tcPr>
+            <w:tcW w:w="2500" w:type="dxa"/>
+            <w:tcMar>
+              <w:top w:w="80" w:type="dxa"/>
+              <w:left w:w="120" w:type="dxa"/>
+              <w:bottom w:w="80" w:type="dxa"/>
+              <w:right w:w="120" w:type="dxa"/>
+            </w:tcMar>
+            <w:vAlign w:val="center"/>
+          </w:tcPr>
+          <w:p>
+            <w:pPr>
+              <w:spacing w:after="40" w:line="259" w:lineRule="auto"/>
+            </w:pPr>
+            <w:r>
+              <w:rPr>
+                <w:color w:val="000000"/>
+                <w:sz w:val="17"/>
+              </w:rPr>
+              <w:t xml:space="preserve">5 o más huéspedes: 13.5 %</w:t>
+            </w:r>
+          </w:p>
+        </w:tc>
+        <w:tc>
+          <w:tcPr>
+            <w:tcW w:w="2600" w:type="dxa"/>
+            <w:tcMar>
+              <w:top w:w="80" w:type="dxa"/>
+              <w:left w:w="120" w:type="dxa"/>
+              <w:bottom w:w="80" w:type="dxa"/>
+              <w:right w:w="120" w:type="dxa"/>
+            </w:tcMar>
+            <w:vAlign w:val="center"/>
+          </w:tcPr>
+          <w:p>
+            <w:pPr>
+              <w:spacing w:after="40" w:line="259" w:lineRule="auto"/>
+            </w:pPr>
+            <w:r>
+              <w:rPr>
+                <w:color w:val="000000"/>
+                <w:sz w:val="17"/>
+              </w:rPr>
+              <w:t xml:space="preserve">1 a 4 huéspedes: 8.8 %</w:t>
+            </w:r>
+          </w:p>
+        </w:tc>
+        <w:tc>
+          <w:tcPr>
+            <w:tcW w:w="1600" w:type="dxa"/>
+            <w:tcMar>
+              <w:top w:w="80" w:type="dxa"/>
+              <w:left w:w="120" w:type="dxa"/>
+              <w:bottom w:w="80" w:type="dxa"/>
+              <w:right w:w="120" w:type="dxa"/>
+            </w:tcMar>
+            <w:vAlign w:val="center"/>
+          </w:tcPr>
+          <w:p>
+            <w:pPr>
+              <w:spacing w:after="40" w:line="259" w:lineRule="auto"/>
+            </w:pPr>
+            <w:r>
+              <w:rPr>
+                <w:color w:val="000000"/>
+                <w:sz w:val="17"/>
+              </w:rPr>
+              <w:t xml:space="preserve">4.7 pp</w:t>
+            </w:r>
+          </w:p>
+        </w:tc>
+      </w:tr>
+      <w:tr>
+        <w:trPr>
+          <w:cantSplit/>
+        </w:trPr>
+        <w:tc>
+          <w:tcPr>
+            <w:tcW w:w="1700" w:type="dxa"/>
+            <w:tcMar>
+              <w:top w:w="80" w:type="dxa"/>
+              <w:left w:w="120" w:type="dxa"/>
+              <w:bottom w:w="80" w:type="dxa"/>
+              <w:right w:w="120" w:type="dxa"/>
+            </w:tcMar>
+            <w:vAlign w:val="center"/>
+          </w:tcPr>
+          <w:p>
+            <w:pPr>
+              <w:spacing w:after="40" w:line="259" w:lineRule="auto"/>
+            </w:pPr>
+            <w:r>
+              <w:rPr>
+                <w:color w:val="000000"/>
+                <w:sz w:val="17"/>
+              </w:rPr>
+              <w:t xml:space="preserve">Tipo de cliente</w:t>
+            </w:r>
+          </w:p>
+        </w:tc>
+        <w:tc>
+          <w:tcPr>
+            <w:tcW w:w="2500" w:type="dxa"/>
+            <w:tcMar>
+              <w:top w:w="80" w:type="dxa"/>
+              <w:left w:w="120" w:type="dxa"/>
+              <w:bottom w:w="80" w:type="dxa"/>
+              <w:right w:w="120" w:type="dxa"/>
+            </w:tcMar>
+            <w:vAlign w:val="center"/>
+          </w:tcPr>
+          <w:p>
+            <w:pPr>
+              <w:spacing w:after="40" w:line="259" w:lineRule="auto"/>
+            </w:pPr>
+            <w:r>
+              <w:rPr>
+                <w:color w:val="000000"/>
+                <w:sz w:val="17"/>
+              </w:rPr>
+              <w:t xml:space="preserve">Nuevo: 10.7 %</w:t>
+            </w:r>
+          </w:p>
+        </w:tc>
+        <w:tc>
+          <w:tcPr>
+            <w:tcW w:w="2600" w:type="dxa"/>
+            <w:tcMar>
+              <w:top w:w="80" w:type="dxa"/>
+              <w:left w:w="120" w:type="dxa"/>
+              <w:bottom w:w="80" w:type="dxa"/>
+              <w:right w:w="120" w:type="dxa"/>
+            </w:tcMar>
+            <w:vAlign w:val="center"/>
+          </w:tcPr>
+          <w:p>
+            <w:pPr>
+              <w:spacing w:after="40" w:line="259" w:lineRule="auto"/>
+            </w:pPr>
+            <w:r>
+              <w:rPr>
+                <w:color w:val="000000"/>
+                <w:sz w:val="17"/>
+              </w:rPr>
+              <w:t xml:space="preserve">Recurrente: 6.6 %</w:t>
+            </w:r>
+          </w:p>
+        </w:tc>
+        <w:tc>
+          <w:tcPr>
+            <w:tcW w:w="1600" w:type="dxa"/>
+            <w:tcMar>
+              <w:top w:w="80" w:type="dxa"/>
+              <w:left w:w="120" w:type="dxa"/>
+              <w:bottom w:w="80" w:type="dxa"/>
+              <w:right w:w="120" w:type="dxa"/>
+            </w:tcMar>
+            <w:vAlign w:val="center"/>
+          </w:tcPr>
+          <w:p>
+            <w:pPr>
+              <w:spacing w:after="40" w:line="259" w:lineRule="auto"/>
+            </w:pPr>
+            <w:r>
+              <w:rPr>
+                <w:color w:val="000000"/>
+                <w:sz w:val="17"/>
+              </w:rPr>
+              <w:t xml:space="preserve">4.1 pp</w:t>
+            </w:r>
+          </w:p>
+        </w:tc>
+      </w:tr>
+      <w:tr>
+        <w:trPr>
+          <w:cantSplit/>
+        </w:trPr>
+        <w:tc>
+          <w:tcPr>
+            <w:tcW w:w="1700" w:type="dxa"/>
+            <w:tcMar>
+              <w:top w:w="80" w:type="dxa"/>
+              <w:left w:w="120" w:type="dxa"/>
+              <w:bottom w:w="80" w:type="dxa"/>
+              <w:right w:w="120" w:type="dxa"/>
+            </w:tcMar>
+            <w:vAlign w:val="center"/>
+          </w:tcPr>
+          <w:p>
+            <w:pPr>
+              <w:spacing w:after="40" w:line="259" w:lineRule="auto"/>
+            </w:pPr>
+            <w:r>
+              <w:rPr>
+                <w:color w:val="000000"/>
+                <w:sz w:val="17"/>
+              </w:rPr>
+              <w:t xml:space="preserve">Solo 2026: zona y pago</w:t>
+            </w:r>
+          </w:p>
+        </w:tc>
+        <w:tc>
+          <w:tcPr>
+            <w:tcW w:w="2500" w:type="dxa"/>
+            <w:tcMar>
+              <w:top w:w="80" w:type="dxa"/>
+              <w:left w:w="120" w:type="dxa"/>
+              <w:bottom w:w="80" w:type="dxa"/>
+              <w:right w:w="120" w:type="dxa"/>
+            </w:tcMar>
+            <w:vAlign w:val="center"/>
+          </w:tcPr>
+          <w:p>
+            <w:pPr>
+              <w:spacing w:after="40" w:line="259" w:lineRule="auto"/>
+            </w:pPr>
+            <w:r>
+              <w:rPr>
+                <w:color w:val="000000"/>
+                <w:sz w:val="17"/>
+              </w:rPr>
+              <w:t xml:space="preserve">Lejana 21.5 %; Efectivo 19.8 %</w:t>
+            </w:r>
+          </w:p>
+        </w:tc>
+        <w:tc>
+          <w:tcPr>
+            <w:tcW w:w="2600" w:type="dxa"/>
+            <w:tcMar>
+              <w:top w:w="80" w:type="dxa"/>
+              <w:left w:w="120" w:type="dxa"/>
+              <w:bottom w:w="80" w:type="dxa"/>
+              <w:right w:w="120" w:type="dxa"/>
+            </w:tcMar>
+            <w:vAlign w:val="center"/>
+          </w:tcPr>
+          <w:p>
+            <w:pPr>
+              <w:spacing w:after="40" w:line="259" w:lineRule="auto"/>
+            </w:pPr>
+            <w:r>
+              <w:rPr>
+                <w:color w:val="000000"/>
+                <w:sz w:val="17"/>
+              </w:rPr>
+              <w:t xml:space="preserve">Cercana 6.9 %; Transferencia 7.7 %</w:t>
+            </w:r>
+          </w:p>
+        </w:tc>
+        <w:tc>
+          <w:tcPr>
+            <w:tcW w:w="1600" w:type="dxa"/>
+            <w:tcMar>
+              <w:top w:w="80" w:type="dxa"/>
+              <w:left w:w="120" w:type="dxa"/>
+              <w:bottom w:w="80" w:type="dxa"/>
+              <w:right w:w="120" w:type="dxa"/>
+            </w:tcMar>
+            <w:vAlign w:val="center"/>
+          </w:tcPr>
+          <w:p>
+            <w:pPr>
+              <w:spacing w:after="40" w:line="259" w:lineRule="auto"/>
+            </w:pPr>
+            <w:r>
+              <w:rPr>
+                <w:color w:val="000000"/>
+                <w:sz w:val="17"/>
+              </w:rPr>
+              <w:t xml:space="preserve">14.6 pp; 12.1 pp</w:t>
+            </w:r>
+          </w:p>
+        </w:tc>
+      </w:tr>
+    </w:tbl>
+    <w:p>
+      <w:pPr>
+        <w:spacing w:after="0"/>
+        <w:rPr>
+          <w:lang w:val="es-PE"/>
+        </w:rPr>
+      </w:pPr>
+    </w:p>
+    <w:p>
+      <w:pPr>
+        <w:spacing w:after="100"/>
+        <w:jc w:val="both"/>
+        <w:rPr>
+          <w:lang w:val="es-PE"/>
+        </w:rPr>
+      </w:pPr>
+      <w:r>
+        <w:rPr>
+          <w:sz w:val="19"/>
+          <w:lang w:val="es-PE"/>
+        </w:rPr>
+        <w:t xml:space="preserve">Además, la participación de los segmentos de mayor riesgo creció en 2026: las reservas pagadas en efectivo pasaron de 29.4 % en 2025 a 43.5 % en 2026, y las de clientes de zonas lejanas de 25.9 % a 34.2 %.</w:t>
+      </w:r>
+    </w:p>
+    <w:p>
+      <w:pPr>
+        <w:spacing w:after="100"/>
+        <w:jc w:val="both"/>
+        <w:rPr>
+          <w:lang w:val="es-PE"/>
+        </w:rPr>
+      </w:pPr>
+      <w:r>
+        <w:rPr>
+          <w:sz w:val="19"/>
+          <w:lang w:val="es-PE"/>
+        </w:rPr>
+        <w:t xml:space="preserve">EXP-02: media de tres repeticiones por lote (rango entre paréntesis).</w:t>
       </w:r>
     </w:p>
     <w:tbl>
@@ -18034,7 +19027,7 @@
           <w:sz w:val="19"/>
           <w:lang w:val="es-PE"/>
         </w:rPr>
-        <w:t xml:space="preserve">EXP-02: resultado de las reglas de calidad.</w:t>
+        <w:t xml:space="preserve">EXP-03: resultado de las reglas de calidad.</w:t>
       </w:r>
     </w:p>
     <w:tbl>
@@ -18490,7 +19483,7 @@
           <w:sz w:val="19"/>
           <w:lang w:val="es-PE"/>
         </w:rPr>
-        <w:t xml:space="preserve">EXP-03: indicadores calculados en SQL y en Power BI.</w:t>
+        <w:t xml:space="preserve">EXP-04: indicadores calculados en SQL y en Power BI.</w:t>
       </w:r>
     </w:p>
     <w:tbl>
@@ -19033,781 +20026,6 @@
           <w:lang w:val="es-PE"/>
         </w:rPr>
       </w:pPr>
-    </w:p>
-    <w:p>
-      <w:pPr>
-        <w:spacing w:after="100"/>
-        <w:jc w:val="both"/>
-        <w:rPr>
-          <w:lang w:val="es-PE"/>
-        </w:rPr>
-      </w:pPr>
-      <w:r>
-        <w:rPr>
-          <w:sz w:val="19"/>
-          <w:lang w:val="es-PE"/>
-        </w:rPr>
-        <w:t xml:space="preserve">Resultados de negocio (estadías con llegada hasta el 23/10/2026):</w:t>
-      </w:r>
-    </w:p>
-    <w:tbl>
-      <w:tblPr>
-        <w:tblStyle w:val="TableGrid"/>
-        <w:tblW w:w="8400" w:type="dxa"/>
-        <w:tblInd w:w="120" w:type="dxa"/>
-        <w:tblLayout w:type="fixed"/>
-        <w:tblLook w:val="04A0" w:firstRow="1" w:lastRow="0" w:firstColumn="1" w:lastColumn="0" w:noHBand="0" w:noVBand="1"/>
-      </w:tblPr>
-      <w:tblGrid>
-        <w:gridCol w:w="1700"/>
-        <w:gridCol w:w="2500"/>
-        <w:gridCol w:w="2600"/>
-        <w:gridCol w:w="1600"/>
-      </w:tblGrid>
-      <w:tr>
-        <w:trPr>
-          <w:cantSplit/>
-          <w:tblHeader/>
-        </w:trPr>
-        <w:tc>
-          <w:tcPr>
-            <w:tcW w:w="1700" w:type="dxa"/>
-            <w:shd w:val="clear" w:color="auto" w:fill="E8EEF5"/>
-            <w:tcMar>
-              <w:top w:w="80" w:type="dxa"/>
-              <w:left w:w="120" w:type="dxa"/>
-              <w:bottom w:w="80" w:type="dxa"/>
-              <w:right w:w="120" w:type="dxa"/>
-            </w:tcMar>
-            <w:vAlign w:val="center"/>
-          </w:tcPr>
-          <w:p>
-            <w:pPr>
-              <w:spacing w:after="40" w:line="259" w:lineRule="auto"/>
-              <w:jc w:val="center"/>
-            </w:pPr>
-            <w:r>
-              <w:rPr>
-                <w:b/>
-                <w:color w:val="0B2545"/>
-                <w:sz w:val="17"/>
-              </w:rPr>
-              <w:t xml:space="preserve">FACTOR</w:t>
-            </w:r>
-          </w:p>
-        </w:tc>
-        <w:tc>
-          <w:tcPr>
-            <w:tcW w:w="2500" w:type="dxa"/>
-            <w:shd w:val="clear" w:color="auto" w:fill="E8EEF5"/>
-            <w:tcMar>
-              <w:top w:w="80" w:type="dxa"/>
-              <w:left w:w="120" w:type="dxa"/>
-              <w:bottom w:w="80" w:type="dxa"/>
-              <w:right w:w="120" w:type="dxa"/>
-            </w:tcMar>
-            <w:vAlign w:val="center"/>
-          </w:tcPr>
-          <w:p>
-            <w:pPr>
-              <w:spacing w:after="40" w:line="259" w:lineRule="auto"/>
-              <w:jc w:val="center"/>
-            </w:pPr>
-            <w:r>
-              <w:rPr>
-                <w:b/>
-                <w:color w:val="0B2545"/>
-                <w:sz w:val="17"/>
-              </w:rPr>
-              <w:t xml:space="preserve">MAYOR NO-LLEGADA</w:t>
-            </w:r>
-          </w:p>
-        </w:tc>
-        <w:tc>
-          <w:tcPr>
-            <w:tcW w:w="2600" w:type="dxa"/>
-            <w:shd w:val="clear" w:color="auto" w:fill="E8EEF5"/>
-            <w:tcMar>
-              <w:top w:w="80" w:type="dxa"/>
-              <w:left w:w="120" w:type="dxa"/>
-              <w:bottom w:w="80" w:type="dxa"/>
-              <w:right w:w="120" w:type="dxa"/>
-            </w:tcMar>
-            <w:vAlign w:val="center"/>
-          </w:tcPr>
-          <w:p>
-            <w:pPr>
-              <w:spacing w:after="40" w:line="259" w:lineRule="auto"/>
-              <w:jc w:val="center"/>
-            </w:pPr>
-            <w:r>
-              <w:rPr>
-                <w:b/>
-                <w:color w:val="0B2545"/>
-                <w:sz w:val="17"/>
-              </w:rPr>
-              <w:t xml:space="preserve">MENOR NO-LLEGADA</w:t>
-            </w:r>
-          </w:p>
-        </w:tc>
-        <w:tc>
-          <w:tcPr>
-            <w:tcW w:w="1600" w:type="dxa"/>
-            <w:shd w:val="clear" w:color="auto" w:fill="E8EEF5"/>
-            <w:tcMar>
-              <w:top w:w="80" w:type="dxa"/>
-              <w:left w:w="120" w:type="dxa"/>
-              <w:bottom w:w="80" w:type="dxa"/>
-              <w:right w:w="120" w:type="dxa"/>
-            </w:tcMar>
-            <w:vAlign w:val="center"/>
-          </w:tcPr>
-          <w:p>
-            <w:pPr>
-              <w:spacing w:after="40" w:line="259" w:lineRule="auto"/>
-              <w:jc w:val="center"/>
-            </w:pPr>
-            <w:r>
-              <w:rPr>
-                <w:b/>
-                <w:color w:val="0B2545"/>
-                <w:sz w:val="17"/>
-              </w:rPr>
-              <w:t xml:space="preserve">BRECHA</w:t>
-            </w:r>
-          </w:p>
-        </w:tc>
-      </w:tr>
-      <w:tr>
-        <w:trPr>
-          <w:cantSplit/>
-        </w:trPr>
-        <w:tc>
-          <w:tcPr>
-            <w:tcW w:w="1700" w:type="dxa"/>
-            <w:tcMar>
-              <w:top w:w="80" w:type="dxa"/>
-              <w:left w:w="120" w:type="dxa"/>
-              <w:bottom w:w="80" w:type="dxa"/>
-              <w:right w:w="120" w:type="dxa"/>
-            </w:tcMar>
-            <w:vAlign w:val="center"/>
-          </w:tcPr>
-          <w:p>
-            <w:pPr>
-              <w:spacing w:after="40" w:line="259" w:lineRule="auto"/>
-            </w:pPr>
-            <w:r>
-              <w:rPr>
-                <w:color w:val="000000"/>
-                <w:sz w:val="17"/>
-              </w:rPr>
-              <w:t xml:space="preserve">Zona de origen</w:t>
-            </w:r>
-          </w:p>
-        </w:tc>
-        <w:tc>
-          <w:tcPr>
-            <w:tcW w:w="2500" w:type="dxa"/>
-            <w:tcMar>
-              <w:top w:w="80" w:type="dxa"/>
-              <w:left w:w="120" w:type="dxa"/>
-              <w:bottom w:w="80" w:type="dxa"/>
-              <w:right w:w="120" w:type="dxa"/>
-            </w:tcMar>
-            <w:vAlign w:val="center"/>
-          </w:tcPr>
-          <w:p>
-            <w:pPr>
-              <w:spacing w:after="40" w:line="259" w:lineRule="auto"/>
-            </w:pPr>
-            <w:r>
-              <w:rPr>
-                <w:color w:val="000000"/>
-                <w:sz w:val="17"/>
-              </w:rPr>
-              <w:t xml:space="preserve">Lejana: 15.2 % (Extranjero 14.6 %)</w:t>
-            </w:r>
-          </w:p>
-        </w:tc>
-        <w:tc>
-          <w:tcPr>
-            <w:tcW w:w="2600" w:type="dxa"/>
-            <w:tcMar>
-              <w:top w:w="80" w:type="dxa"/>
-              <w:left w:w="120" w:type="dxa"/>
-              <w:bottom w:w="80" w:type="dxa"/>
-              <w:right w:w="120" w:type="dxa"/>
-            </w:tcMar>
-            <w:vAlign w:val="center"/>
-          </w:tcPr>
-          <w:p>
-            <w:pPr>
-              <w:spacing w:after="40" w:line="259" w:lineRule="auto"/>
-            </w:pPr>
-            <w:r>
-              <w:rPr>
-                <w:color w:val="000000"/>
-                <w:sz w:val="17"/>
-              </w:rPr>
-              <w:t xml:space="preserve">Cercana a Oxapampa: 4.5 % (Lima 8.6 %)</w:t>
-            </w:r>
-          </w:p>
-        </w:tc>
-        <w:tc>
-          <w:tcPr>
-            <w:tcW w:w="1600" w:type="dxa"/>
-            <w:tcMar>
-              <w:top w:w="80" w:type="dxa"/>
-              <w:left w:w="120" w:type="dxa"/>
-              <w:bottom w:w="80" w:type="dxa"/>
-              <w:right w:w="120" w:type="dxa"/>
-            </w:tcMar>
-            <w:vAlign w:val="center"/>
-          </w:tcPr>
-          <w:p>
-            <w:pPr>
-              <w:spacing w:after="40" w:line="259" w:lineRule="auto"/>
-            </w:pPr>
-            <w:r>
-              <w:rPr>
-                <w:color w:val="000000"/>
-                <w:sz w:val="17"/>
-              </w:rPr>
-              <w:t xml:space="preserve">10.7 pp</w:t>
-            </w:r>
-          </w:p>
-        </w:tc>
-      </w:tr>
-      <w:tr>
-        <w:trPr>
-          <w:cantSplit/>
-        </w:trPr>
-        <w:tc>
-          <w:tcPr>
-            <w:tcW w:w="1700" w:type="dxa"/>
-            <w:tcMar>
-              <w:top w:w="80" w:type="dxa"/>
-              <w:left w:w="120" w:type="dxa"/>
-              <w:bottom w:w="80" w:type="dxa"/>
-              <w:right w:w="120" w:type="dxa"/>
-            </w:tcMar>
-            <w:vAlign w:val="center"/>
-          </w:tcPr>
-          <w:p>
-            <w:pPr>
-              <w:spacing w:after="40" w:line="259" w:lineRule="auto"/>
-            </w:pPr>
-            <w:r>
-              <w:rPr>
-                <w:color w:val="000000"/>
-                <w:sz w:val="17"/>
-              </w:rPr>
-              <w:t xml:space="preserve">Método de pago</w:t>
-            </w:r>
-          </w:p>
-        </w:tc>
-        <w:tc>
-          <w:tcPr>
-            <w:tcW w:w="2500" w:type="dxa"/>
-            <w:tcMar>
-              <w:top w:w="80" w:type="dxa"/>
-              <w:left w:w="120" w:type="dxa"/>
-              <w:bottom w:w="80" w:type="dxa"/>
-              <w:right w:w="120" w:type="dxa"/>
-            </w:tcMar>
-            <w:vAlign w:val="center"/>
-          </w:tcPr>
-          <w:p>
-            <w:pPr>
-              <w:spacing w:after="40" w:line="259" w:lineRule="auto"/>
-            </w:pPr>
-            <w:r>
-              <w:rPr>
-                <w:color w:val="000000"/>
-                <w:sz w:val="17"/>
-              </w:rPr>
-              <w:t xml:space="preserve">Efectivo: 13.5 %</w:t>
-            </w:r>
-          </w:p>
-        </w:tc>
-        <w:tc>
-          <w:tcPr>
-            <w:tcW w:w="2600" w:type="dxa"/>
-            <w:tcMar>
-              <w:top w:w="80" w:type="dxa"/>
-              <w:left w:w="120" w:type="dxa"/>
-              <w:bottom w:w="80" w:type="dxa"/>
-              <w:right w:w="120" w:type="dxa"/>
-            </w:tcMar>
-            <w:vAlign w:val="center"/>
-          </w:tcPr>
-          <w:p>
-            <w:pPr>
-              <w:spacing w:after="40" w:line="259" w:lineRule="auto"/>
-            </w:pPr>
-            <w:r>
-              <w:rPr>
-                <w:color w:val="000000"/>
-                <w:sz w:val="17"/>
-              </w:rPr>
-              <w:t xml:space="preserve">Transferencia: 6.8 % (Tarjeta 8.3 %)</w:t>
-            </w:r>
-          </w:p>
-        </w:tc>
-        <w:tc>
-          <w:tcPr>
-            <w:tcW w:w="1600" w:type="dxa"/>
-            <w:tcMar>
-              <w:top w:w="80" w:type="dxa"/>
-              <w:left w:w="120" w:type="dxa"/>
-              <w:bottom w:w="80" w:type="dxa"/>
-              <w:right w:w="120" w:type="dxa"/>
-            </w:tcMar>
-            <w:vAlign w:val="center"/>
-          </w:tcPr>
-          <w:p>
-            <w:pPr>
-              <w:spacing w:after="40" w:line="259" w:lineRule="auto"/>
-            </w:pPr>
-            <w:r>
-              <w:rPr>
-                <w:color w:val="000000"/>
-                <w:sz w:val="17"/>
-              </w:rPr>
-              <w:t xml:space="preserve">6.7 pp</w:t>
-            </w:r>
-          </w:p>
-        </w:tc>
-      </w:tr>
-      <w:tr>
-        <w:trPr>
-          <w:cantSplit/>
-        </w:trPr>
-        <w:tc>
-          <w:tcPr>
-            <w:tcW w:w="1700" w:type="dxa"/>
-            <w:tcMar>
-              <w:top w:w="80" w:type="dxa"/>
-              <w:left w:w="120" w:type="dxa"/>
-              <w:bottom w:w="80" w:type="dxa"/>
-              <w:right w:w="120" w:type="dxa"/>
-            </w:tcMar>
-            <w:vAlign w:val="center"/>
-          </w:tcPr>
-          <w:p>
-            <w:pPr>
-              <w:spacing w:after="40" w:line="259" w:lineRule="auto"/>
-            </w:pPr>
-            <w:r>
-              <w:rPr>
-                <w:color w:val="000000"/>
-                <w:sz w:val="17"/>
-              </w:rPr>
-              <w:t xml:space="preserve">Categoría</w:t>
-            </w:r>
-          </w:p>
-        </w:tc>
-        <w:tc>
-          <w:tcPr>
-            <w:tcW w:w="2500" w:type="dxa"/>
-            <w:tcMar>
-              <w:top w:w="80" w:type="dxa"/>
-              <w:left w:w="120" w:type="dxa"/>
-              <w:bottom w:w="80" w:type="dxa"/>
-              <w:right w:w="120" w:type="dxa"/>
-            </w:tcMar>
-            <w:vAlign w:val="center"/>
-          </w:tcPr>
-          <w:p>
-            <w:pPr>
-              <w:spacing w:after="40" w:line="259" w:lineRule="auto"/>
-            </w:pPr>
-            <w:r>
-              <w:rPr>
-                <w:color w:val="000000"/>
-                <w:sz w:val="17"/>
-              </w:rPr>
-              <w:t xml:space="preserve">Cabaña Bungalow: 15.9 % (Domo Colibrí 14.3 %)</w:t>
-            </w:r>
-          </w:p>
-        </w:tc>
-        <w:tc>
-          <w:tcPr>
-            <w:tcW w:w="2600" w:type="dxa"/>
-            <w:tcMar>
-              <w:top w:w="80" w:type="dxa"/>
-              <w:left w:w="120" w:type="dxa"/>
-              <w:bottom w:w="80" w:type="dxa"/>
-              <w:right w:w="120" w:type="dxa"/>
-            </w:tcMar>
-            <w:vAlign w:val="center"/>
-          </w:tcPr>
-          <w:p>
-            <w:pPr>
-              <w:spacing w:after="40" w:line="259" w:lineRule="auto"/>
-            </w:pPr>
-            <w:r>
-              <w:rPr>
-                <w:color w:val="000000"/>
-                <w:sz w:val="17"/>
-              </w:rPr>
-              <w:t xml:space="preserve">Habitación Matrimonial: 7.0 %</w:t>
-            </w:r>
-          </w:p>
-        </w:tc>
-        <w:tc>
-          <w:tcPr>
-            <w:tcW w:w="1600" w:type="dxa"/>
-            <w:tcMar>
-              <w:top w:w="80" w:type="dxa"/>
-              <w:left w:w="120" w:type="dxa"/>
-              <w:bottom w:w="80" w:type="dxa"/>
-              <w:right w:w="120" w:type="dxa"/>
-            </w:tcMar>
-            <w:vAlign w:val="center"/>
-          </w:tcPr>
-          <w:p>
-            <w:pPr>
-              <w:spacing w:after="40" w:line="259" w:lineRule="auto"/>
-            </w:pPr>
-            <w:r>
-              <w:rPr>
-                <w:color w:val="000000"/>
-                <w:sz w:val="17"/>
-              </w:rPr>
-              <w:t xml:space="preserve">8.9 pp</w:t>
-            </w:r>
-          </w:p>
-        </w:tc>
-      </w:tr>
-      <w:tr>
-        <w:trPr>
-          <w:cantSplit/>
-        </w:trPr>
-        <w:tc>
-          <w:tcPr>
-            <w:tcW w:w="1700" w:type="dxa"/>
-            <w:tcMar>
-              <w:top w:w="80" w:type="dxa"/>
-              <w:left w:w="120" w:type="dxa"/>
-              <w:bottom w:w="80" w:type="dxa"/>
-              <w:right w:w="120" w:type="dxa"/>
-            </w:tcMar>
-            <w:vAlign w:val="center"/>
-          </w:tcPr>
-          <w:p>
-            <w:pPr>
-              <w:spacing w:after="40" w:line="259" w:lineRule="auto"/>
-            </w:pPr>
-            <w:r>
-              <w:rPr>
-                <w:color w:val="000000"/>
-                <w:sz w:val="17"/>
-              </w:rPr>
-              <w:t xml:space="preserve">Tamaño del grupo</w:t>
-            </w:r>
-          </w:p>
-        </w:tc>
-        <w:tc>
-          <w:tcPr>
-            <w:tcW w:w="2500" w:type="dxa"/>
-            <w:tcMar>
-              <w:top w:w="80" w:type="dxa"/>
-              <w:left w:w="120" w:type="dxa"/>
-              <w:bottom w:w="80" w:type="dxa"/>
-              <w:right w:w="120" w:type="dxa"/>
-            </w:tcMar>
-            <w:vAlign w:val="center"/>
-          </w:tcPr>
-          <w:p>
-            <w:pPr>
-              <w:spacing w:after="40" w:line="259" w:lineRule="auto"/>
-            </w:pPr>
-            <w:r>
-              <w:rPr>
-                <w:color w:val="000000"/>
-                <w:sz w:val="17"/>
-              </w:rPr>
-              <w:t xml:space="preserve">5 o más huéspedes: 13.5 %</w:t>
-            </w:r>
-          </w:p>
-        </w:tc>
-        <w:tc>
-          <w:tcPr>
-            <w:tcW w:w="2600" w:type="dxa"/>
-            <w:tcMar>
-              <w:top w:w="80" w:type="dxa"/>
-              <w:left w:w="120" w:type="dxa"/>
-              <w:bottom w:w="80" w:type="dxa"/>
-              <w:right w:w="120" w:type="dxa"/>
-            </w:tcMar>
-            <w:vAlign w:val="center"/>
-          </w:tcPr>
-          <w:p>
-            <w:pPr>
-              <w:spacing w:after="40" w:line="259" w:lineRule="auto"/>
-            </w:pPr>
-            <w:r>
-              <w:rPr>
-                <w:color w:val="000000"/>
-                <w:sz w:val="17"/>
-              </w:rPr>
-              <w:t xml:space="preserve">1 a 4 huéspedes: 8.8 %</w:t>
-            </w:r>
-          </w:p>
-        </w:tc>
-        <w:tc>
-          <w:tcPr>
-            <w:tcW w:w="1600" w:type="dxa"/>
-            <w:tcMar>
-              <w:top w:w="80" w:type="dxa"/>
-              <w:left w:w="120" w:type="dxa"/>
-              <w:bottom w:w="80" w:type="dxa"/>
-              <w:right w:w="120" w:type="dxa"/>
-            </w:tcMar>
-            <w:vAlign w:val="center"/>
-          </w:tcPr>
-          <w:p>
-            <w:pPr>
-              <w:spacing w:after="40" w:line="259" w:lineRule="auto"/>
-            </w:pPr>
-            <w:r>
-              <w:rPr>
-                <w:color w:val="000000"/>
-                <w:sz w:val="17"/>
-              </w:rPr>
-              <w:t xml:space="preserve">4.7 pp</w:t>
-            </w:r>
-          </w:p>
-        </w:tc>
-      </w:tr>
-      <w:tr>
-        <w:trPr>
-          <w:cantSplit/>
-        </w:trPr>
-        <w:tc>
-          <w:tcPr>
-            <w:tcW w:w="1700" w:type="dxa"/>
-            <w:tcMar>
-              <w:top w:w="80" w:type="dxa"/>
-              <w:left w:w="120" w:type="dxa"/>
-              <w:bottom w:w="80" w:type="dxa"/>
-              <w:right w:w="120" w:type="dxa"/>
-            </w:tcMar>
-            <w:vAlign w:val="center"/>
-          </w:tcPr>
-          <w:p>
-            <w:pPr>
-              <w:spacing w:after="40" w:line="259" w:lineRule="auto"/>
-            </w:pPr>
-            <w:r>
-              <w:rPr>
-                <w:color w:val="000000"/>
-                <w:sz w:val="17"/>
-              </w:rPr>
-              <w:t xml:space="preserve">Tipo de cliente</w:t>
-            </w:r>
-          </w:p>
-        </w:tc>
-        <w:tc>
-          <w:tcPr>
-            <w:tcW w:w="2500" w:type="dxa"/>
-            <w:tcMar>
-              <w:top w:w="80" w:type="dxa"/>
-              <w:left w:w="120" w:type="dxa"/>
-              <w:bottom w:w="80" w:type="dxa"/>
-              <w:right w:w="120" w:type="dxa"/>
-            </w:tcMar>
-            <w:vAlign w:val="center"/>
-          </w:tcPr>
-          <w:p>
-            <w:pPr>
-              <w:spacing w:after="40" w:line="259" w:lineRule="auto"/>
-            </w:pPr>
-            <w:r>
-              <w:rPr>
-                <w:color w:val="000000"/>
-                <w:sz w:val="17"/>
-              </w:rPr>
-              <w:t xml:space="preserve">Nuevo: 10.7 %</w:t>
-            </w:r>
-          </w:p>
-        </w:tc>
-        <w:tc>
-          <w:tcPr>
-            <w:tcW w:w="2600" w:type="dxa"/>
-            <w:tcMar>
-              <w:top w:w="80" w:type="dxa"/>
-              <w:left w:w="120" w:type="dxa"/>
-              <w:bottom w:w="80" w:type="dxa"/>
-              <w:right w:w="120" w:type="dxa"/>
-            </w:tcMar>
-            <w:vAlign w:val="center"/>
-          </w:tcPr>
-          <w:p>
-            <w:pPr>
-              <w:spacing w:after="40" w:line="259" w:lineRule="auto"/>
-            </w:pPr>
-            <w:r>
-              <w:rPr>
-                <w:color w:val="000000"/>
-                <w:sz w:val="17"/>
-              </w:rPr>
-              <w:t xml:space="preserve">Recurrente: 6.6 %</w:t>
-            </w:r>
-          </w:p>
-        </w:tc>
-        <w:tc>
-          <w:tcPr>
-            <w:tcW w:w="1600" w:type="dxa"/>
-            <w:tcMar>
-              <w:top w:w="80" w:type="dxa"/>
-              <w:left w:w="120" w:type="dxa"/>
-              <w:bottom w:w="80" w:type="dxa"/>
-              <w:right w:w="120" w:type="dxa"/>
-            </w:tcMar>
-            <w:vAlign w:val="center"/>
-          </w:tcPr>
-          <w:p>
-            <w:pPr>
-              <w:spacing w:after="40" w:line="259" w:lineRule="auto"/>
-            </w:pPr>
-            <w:r>
-              <w:rPr>
-                <w:color w:val="000000"/>
-                <w:sz w:val="17"/>
-              </w:rPr>
-              <w:t xml:space="preserve">4.1 pp</w:t>
-            </w:r>
-          </w:p>
-        </w:tc>
-      </w:tr>
-      <w:tr>
-        <w:trPr>
-          <w:cantSplit/>
-        </w:trPr>
-        <w:tc>
-          <w:tcPr>
-            <w:tcW w:w="1700" w:type="dxa"/>
-            <w:tcMar>
-              <w:top w:w="80" w:type="dxa"/>
-              <w:left w:w="120" w:type="dxa"/>
-              <w:bottom w:w="80" w:type="dxa"/>
-              <w:right w:w="120" w:type="dxa"/>
-            </w:tcMar>
-            <w:vAlign w:val="center"/>
-          </w:tcPr>
-          <w:p>
-            <w:pPr>
-              <w:spacing w:after="40" w:line="259" w:lineRule="auto"/>
-            </w:pPr>
-            <w:r>
-              <w:rPr>
-                <w:color w:val="000000"/>
-                <w:sz w:val="17"/>
-              </w:rPr>
-              <w:t xml:space="preserve">Solo 2026: zona y pago</w:t>
-            </w:r>
-          </w:p>
-        </w:tc>
-        <w:tc>
-          <w:tcPr>
-            <w:tcW w:w="2500" w:type="dxa"/>
-            <w:tcMar>
-              <w:top w:w="80" w:type="dxa"/>
-              <w:left w:w="120" w:type="dxa"/>
-              <w:bottom w:w="80" w:type="dxa"/>
-              <w:right w:w="120" w:type="dxa"/>
-            </w:tcMar>
-            <w:vAlign w:val="center"/>
-          </w:tcPr>
-          <w:p>
-            <w:pPr>
-              <w:spacing w:after="40" w:line="259" w:lineRule="auto"/>
-            </w:pPr>
-            <w:r>
-              <w:rPr>
-                <w:color w:val="000000"/>
-                <w:sz w:val="17"/>
-              </w:rPr>
-              <w:t xml:space="preserve">Lejana 21.5 %; Efectivo 19.8 %</w:t>
-            </w:r>
-          </w:p>
-        </w:tc>
-        <w:tc>
-          <w:tcPr>
-            <w:tcW w:w="2600" w:type="dxa"/>
-            <w:tcMar>
-              <w:top w:w="80" w:type="dxa"/>
-              <w:left w:w="120" w:type="dxa"/>
-              <w:bottom w:w="80" w:type="dxa"/>
-              <w:right w:w="120" w:type="dxa"/>
-            </w:tcMar>
-            <w:vAlign w:val="center"/>
-          </w:tcPr>
-          <w:p>
-            <w:pPr>
-              <w:spacing w:after="40" w:line="259" w:lineRule="auto"/>
-            </w:pPr>
-            <w:r>
-              <w:rPr>
-                <w:color w:val="000000"/>
-                <w:sz w:val="17"/>
-              </w:rPr>
-              <w:t xml:space="preserve">Cercana 6.9 %; Transferencia 7.7 %</w:t>
-            </w:r>
-          </w:p>
-        </w:tc>
-        <w:tc>
-          <w:tcPr>
-            <w:tcW w:w="1600" w:type="dxa"/>
-            <w:tcMar>
-              <w:top w:w="80" w:type="dxa"/>
-              <w:left w:w="120" w:type="dxa"/>
-              <w:bottom w:w="80" w:type="dxa"/>
-              <w:right w:w="120" w:type="dxa"/>
-            </w:tcMar>
-            <w:vAlign w:val="center"/>
-          </w:tcPr>
-          <w:p>
-            <w:pPr>
-              <w:spacing w:after="40" w:line="259" w:lineRule="auto"/>
-            </w:pPr>
-            <w:r>
-              <w:rPr>
-                <w:color w:val="000000"/>
-                <w:sz w:val="17"/>
-              </w:rPr>
-              <w:t xml:space="preserve">14.6 pp; 12.1 pp</w:t>
-            </w:r>
-          </w:p>
-        </w:tc>
-      </w:tr>
-    </w:tbl>
-    <w:p>
-      <w:pPr>
-        <w:spacing w:after="0"/>
-        <w:rPr>
-          <w:lang w:val="es-PE"/>
-        </w:rPr>
-      </w:pPr>
-    </w:p>
-    <w:p>
-      <w:pPr>
-        <w:spacing w:after="100"/>
-        <w:jc w:val="both"/>
-        <w:rPr>
-          <w:lang w:val="es-PE"/>
-        </w:rPr>
-      </w:pPr>
-      <w:r>
-        <w:rPr>
-          <w:sz w:val="19"/>
-          <w:lang w:val="es-PE"/>
-        </w:rPr>
-        <w:t xml:space="preserve">Además, la participación de los segmentos de mayor riesgo creció en 2026: las reservas pagadas en efectivo pasaron de 29.4 % en 2025 a 43.5 % en 2026, y las de clientes de zonas lejanas de 25.9 % a 34.2 %.</w:t>
-      </w:r>
     </w:p>
     <w:p>
       <w:pPr>
@@ -20064,14 +20282,14 @@
           <w:sz w:val="19"/>
           <w:lang w:val="es-PE"/>
         </w:rPr>
-        <w:t xml:space="preserve">Rendimiento (H1). </w:t>
+        <w:t xml:space="preserve">Factores de no-llegada (H1, pregunta principal). </w:t>
       </w:r>
       <w:r>
         <w:rPr>
           <w:sz w:val="19"/>
           <w:lang w:val="es-PE"/>
         </w:rPr>
-        <w:t xml:space="preserve">El costo del ETL crece de forma casi lineal: al pasar de 500 a 15 000 estadías (30 veces más datos) la duración pasa de 0.67 s a 3.46 s (5 veces más), porque existe un costo fijo de alrededor de medio segundo (limpieza, dimensiones y calendario) que no depende del volumen. Con 15 000 estadías el ETL sigue por debajo de 5 s, por lo que H1 se cumple. El paso más costoso no es la tabla de hechos sino la calidad de datos (52 % del tiempo con 15 000 filas), porque sus reglas recorren el staging varias veces; es el principal punto de mejora. La variación entre repeticiones fue mayor en 5 000 y 8 000 filas (hasta 1.5 s), atribuible a otras tareas del sistema operativo durante la medición.</w:t>
+        <w:t xml:space="preserve">La brecha de no-llegada entre zona lejana (15.2 %) y cercana (4.5 %) es de 10.7 puntos porcentuales y en 2026 llega a 14.6 pp; con el método de pago llega a 12.1 pp en 2026, por lo que se cumple la primera parte de H1. Además, la participación de los segmentos de mayor riesgo creció: el pago en efectivo pasó de 29.4 % a 43.5 % de las reservas y la zona lejana de 25.9 % a 34.2 %, lo que confirma la segunda parte de H1: la caída de 2026 coincide con un mayor peso de los segmentos que menos llegan. Esto es una asociación observada en los datos, no una relación causal demostrada: el experimento no permite afirmar que el pago en efectivo cause la cancelación.</w:t>
       </w:r>
     </w:p>
     <w:p>
@@ -20088,14 +20306,14 @@
           <w:sz w:val="19"/>
           <w:lang w:val="es-PE"/>
         </w:rPr>
-        <w:t xml:space="preserve">Calidad (H2). </w:t>
+        <w:t xml:space="preserve">Rendimiento (H2). </w:t>
       </w:r>
       <w:r>
         <w:rPr>
           <w:sz w:val="19"/>
           <w:lang w:val="es-PE"/>
         </w:rPr>
-        <w:t xml:space="preserve">Las reglas detectaron los 14 registros defectuosos inyectados (100 %) y los 9 036 válidos llegaron al datamart; un archivo faltante quedó registrado como ERROR sin detener los pasos siguientes. H2 se cumple. Un hallazgo de la implementación fue que la condición NOT IN sobre 9 000 filas hacía que el paso tardara 21.7 s; con NOT EXISTS bajó a 1.2 s (−94 %).</w:t>
+        <w:t xml:space="preserve">El costo del ETL crece de forma casi lineal: al pasar de 500 a 15 000 estadías (30 veces más datos) la duración pasa de 0.67 s a 3.46 s (5 veces más), porque existe un costo fijo de alrededor de medio segundo (limpieza, dimensiones y calendario) que no depende del volumen. Con 15 000 estadías el ETL sigue por debajo de 5 s, por lo que H2 se cumple. El paso más costoso no es la tabla de hechos sino la calidad de datos (52 % del tiempo con 15 000 filas), porque sus reglas recorren el staging varias veces; es el principal punto de mejora. La variación entre repeticiones fue mayor en 5 000 y 8 000 filas (hasta 1.5 s), atribuible a otras tareas del sistema operativo durante la medición.</w:t>
       </w:r>
     </w:p>
     <w:p>
@@ -20112,14 +20330,14 @@
           <w:sz w:val="19"/>
           <w:lang w:val="es-PE"/>
         </w:rPr>
-        <w:t xml:space="preserve">Exactitud (H3). </w:t>
+        <w:t xml:space="preserve">Calidad (H3). </w:t>
       </w:r>
       <w:r>
         <w:rPr>
           <w:sz w:val="19"/>
           <w:lang w:val="es-PE"/>
         </w:rPr>
-        <w:t xml:space="preserve">Los indicadores coinciden exactamente entre SQL y Power BI (diferencia 0), lo que valida las medidas DAX y la relación con dim_tiempo. H3 se cumple.</w:t>
+        <w:t xml:space="preserve">Las reglas detectaron los 14 registros defectuosos inyectados (100 %) y los 9 036 válidos llegaron al datamart; un archivo faltante quedó registrado como ERROR sin detener los pasos siguientes. H3 se cumple: los errores de datos no distorsionan las tasas de no-llegada. Un hallazgo de la implementación fue que la condición NOT IN sobre 9 000 filas hacía que el paso tardara 21.7 s; con NOT EXISTS bajó a 1.2 s (−94 %).</w:t>
       </w:r>
     </w:p>
     <w:p>
@@ -20136,14 +20354,14 @@
           <w:sz w:val="19"/>
           <w:lang w:val="es-PE"/>
         </w:rPr>
-        <w:t xml:space="preserve">Negocio. </w:t>
+        <w:t xml:space="preserve">Exactitud (H4). </w:t>
       </w:r>
       <w:r>
         <w:rPr>
           <w:sz w:val="19"/>
           <w:lang w:val="es-PE"/>
         </w:rPr>
-        <w:t xml:space="preserve">La brecha de no-llegada entre zona lejana (15.2 %) y cercana (4.5 %) es de 10.7 puntos porcentuales y en 2026 llega a 14.6 pp; con el método de pago llega a 12.1 pp en 2026. Además, la participación de los segmentos de mayor riesgo creció: el pago en efectivo pasó de 29.4 % a 43.5 % de las reservas y la zona lejana de 25.9 % a 34.2 %. Esto es una asociación observada en los datos, no una relación causal demostrada: el experimento no permite afirmar que el pago en efectivo cause la cancelación.</w:t>
+        <w:t xml:space="preserve">Los indicadores coinciden exactamente entre SQL y Power BI (diferencia 0), lo que valida las medidas DAX y la relación con dim_tiempo. H4 se cumple.</w:t>
       </w:r>
     </w:p>
     <w:p>
@@ -21362,7 +21580,7 @@
                 <w:color w:val="000000"/>
                 <w:sz w:val="16"/>
               </w:rPr>
-              <w:t xml:space="preserve">15 000 estadías en 3.46 s; SQL = Power BI</w:t>
+              <w:t xml:space="preserve">EXP-01: brecha de 10.7 pp por zona (14.6 pp en 2026); EXP-02 a EXP-04: 15 000 estadías en 3.46 s, 100 % de defectos detectados, SQL = Power BI</w:t>
             </w:r>
           </w:p>
         </w:tc>
@@ -21386,7 +21604,7 @@
                 <w:color w:val="000000"/>
                 <w:sz w:val="16"/>
               </w:rPr>
-              <w:t xml:space="preserve">La solución escala de forma casi lineal y sus indicadores son exactos</w:t>
+              <w:t xml:space="preserve">La no-llegada se asocia a segmentos que crecieron en 2026, y la solución que lo muestra es escalable, confiable y exacta</w:t>
             </w:r>
           </w:p>
         </w:tc>
@@ -21410,7 +21628,7 @@
                 <w:color w:val="000000"/>
                 <w:sz w:val="16"/>
               </w:rPr>
-              <w:t xml:space="preserve">Carga incremental e índices en el staging</w:t>
+              <w:t xml:space="preserve">Ofertas dirigidas; carga incremental e índices en el staging</w:t>
             </w:r>
           </w:p>
         </w:tc>
@@ -21501,7 +21719,7 @@
           <w:sz w:val="19"/>
           <w:lang w:val="es-PE"/>
         </w:rPr>
-        <w:t xml:space="preserve">La no-llegada se concentra en segmentos identificables: zona lejana frente a cercana (15.2 % frente a 4.5 %, brecha de 10.7 pp que cumple el objetivo de 10 pp) y pago en efectivo frente a transferencia (13.5 % frente a 6.8 %); además, estos segmentos ganaron participación en 2026, lo que explica parte de la caída (Figura 4).</w:t>
+        <w:t xml:space="preserve">La no-llegada se concentra en segmentos identificables: zona lejana frente a cercana (15.2 % frente a 4.5 %, brecha de 10.7 pp que cumple el objetivo de 10 pp) y pago en efectivo frente a transferencia (13.5 % frente a 6.8 %); además, estos segmentos ganaron participación en 2026, lo que explica parte de la caída (EXP-01, Figura 4).</w:t>
       </w:r>
     </w:p>
     <w:p>
@@ -21525,7 +21743,7 @@
           <w:sz w:val="19"/>
           <w:lang w:val="es-PE"/>
         </w:rPr>
-        <w:t xml:space="preserve">El ETL de ocho pasos es confiable: reconcilia el 100 % de las filas, detectó el 100 % de los registros defectuosos inyectados mediante 11 reglas y registra los errores sin detener el proceso, con una ejecución automática diaria (EXP-02, T-03, T-04, T-07).</w:t>
+        <w:t xml:space="preserve">El ETL de ocho pasos es confiable: reconcilia el 100 % de las filas, detectó el 100 % de los registros defectuosos inyectados mediante 11 reglas y registra los errores sin detener el proceso, con una ejecución automática diaria (EXP-03, T-03, T-04, T-07).</w:t>
       </w:r>
     </w:p>
     <w:p>
@@ -21549,7 +21767,7 @@
           <w:sz w:val="19"/>
           <w:lang w:val="es-PE"/>
         </w:rPr>
-        <w:t xml:space="preserve">El costo del ETL crece de forma casi lineal (de 0.67 s con 500 estadías a 3.46 s con 15 000) y el paso más costoso es la calidad de datos; reemplazar NOT IN por NOT EXISTS redujo ese paso en 94 %, lo que muestra que el diseño de las consultas pesa más que el volumen actual (EXP-01).</w:t>
+        <w:t xml:space="preserve">El costo del ETL crece de forma casi lineal (de 0.67 s con 500 estadías a 3.46 s con 15 000) y el paso más costoso es la calidad de datos; reemplazar NOT IN por NOT EXISTS redujo ese paso en 94 %, lo que muestra que el diseño de las consultas pesa más que el volumen actual (EXP-02).</w:t>
       </w:r>
     </w:p>
     <w:p>
@@ -21573,7 +21791,7 @@
           <w:sz w:val="19"/>
           <w:lang w:val="es-PE"/>
         </w:rPr>
-        <w:t xml:space="preserve">Los indicadores del dashboard coinciden exactamente con las consultas SQL sobre el datamart, por lo que las medidas DAX y el modelo estrella son una base confiable para la toma de decisiones (EXP-03).</w:t>
+        <w:t xml:space="preserve">Los indicadores del dashboard coinciden exactamente con las consultas SQL sobre el datamart, por lo que las medidas DAX y el modelo estrella son una base confiable para la toma de decisiones (EXP-04).</w:t>
       </w:r>
     </w:p>
     <w:p>
@@ -22448,7 +22666,7 @@
                 <w:color w:val="000000"/>
                 <w:sz w:val="15"/>
               </w:rPr>
-              <w:t xml:space="preserve">Reglas de simulación (sección 1.4); lotes y defectos de EXP-01 y EXP-02</w:t>
+              <w:t xml:space="preserve">Reglas de simulación (sección 1.4); lotes y defectos de EXP-02 y EXP-03</w:t>
             </w:r>
           </w:p>
         </w:tc>

</xml_diff>